<commit_message>
comentarios y mejora ortografía
</commit_message>
<xml_diff>
--- a/Fase 1/Evidencias Individuales/Jorge_Curiqueo_1.1_APT122_AutoevaluacionCompetenciasFase1.docx
+++ b/Fase 1/Evidencias Individuales/Jorge_Curiqueo_1.1_APT122_AutoevaluacionCompetenciasFase1.docx
@@ -1,6 +1,6 @@
 
 <file path=word/document.xml><?xml version="1.0" encoding="utf-8"?>
-<w:document xmlns:wpc="http://schemas.microsoft.com/office/word/2010/wordprocessingCanvas" xmlns:cx="http://schemas.microsoft.com/office/drawing/2014/chartex" xmlns:cx1="http://schemas.microsoft.com/office/drawing/2015/9/8/chartex" xmlns:cx2="http://schemas.microsoft.com/office/drawing/2015/10/21/chartex" xmlns:cx3="http://schemas.microsoft.com/office/drawing/2016/5/9/chartex" xmlns:cx4="http://schemas.microsoft.com/office/drawing/2016/5/10/chartex" xmlns:cx5="http://schemas.microsoft.com/office/drawing/2016/5/11/chartex" xmlns:cx6="http://schemas.microsoft.com/office/drawing/2016/5/12/chartex" xmlns:cx7="http://schemas.microsoft.com/office/drawing/2016/5/13/chartex" xmlns:cx8="http://schemas.microsoft.com/office/drawing/2016/5/14/chartex" xmlns:mc="http://schemas.openxmlformats.org/markup-compatibility/2006" xmlns:aink="http://schemas.microsoft.com/office/drawing/2016/ink" xmlns:am3d="http://schemas.microsoft.com/office/drawing/2017/model3d" xmlns:o="urn:schemas-microsoft-com:office:office" xmlns:r="http://schemas.openxmlformats.org/officeDocument/2006/relationships" xmlns:m="http://schemas.openxmlformats.org/officeDocument/2006/math" xmlns:v="urn:schemas-microsoft-com:vml" xmlns:wp14="http://schemas.microsoft.com/office/word/2010/wordprocessingDrawing" xmlns:wp="http://schemas.openxmlformats.org/drawingml/2006/wordprocessingDrawing" xmlns:w10="urn:schemas-microsoft-com:office:word" xmlns:w="http://schemas.openxmlformats.org/wordprocessingml/2006/main" xmlns:w14="http://schemas.microsoft.com/office/word/2010/wordml" xmlns:w15="http://schemas.microsoft.com/office/word/2012/wordml" xmlns:w16cex="http://schemas.microsoft.com/office/word/2018/wordml/cex" xmlns:w16cid="http://schemas.microsoft.com/office/word/2016/wordml/cid" xmlns:w16="http://schemas.microsoft.com/office/word/2018/wordml" xmlns:w16sdtdh="http://schemas.microsoft.com/office/word/2020/wordml/sdtdatahash" xmlns:w16se="http://schemas.microsoft.com/office/word/2015/wordml/symex" xmlns:wpg="http://schemas.microsoft.com/office/word/2010/wordprocessingGroup" xmlns:wpi="http://schemas.microsoft.com/office/word/2010/wordprocessingInk" xmlns:wne="http://schemas.microsoft.com/office/word/2006/wordml" xmlns:wps="http://schemas.microsoft.com/office/word/2010/wordprocessingShape" mc:Ignorable="w14 w15 w16se w16cid w16 w16cex w16sdtdh wp14">
+<w:document xmlns:wpc="http://schemas.microsoft.com/office/word/2010/wordprocessingCanvas" xmlns:cx="http://schemas.microsoft.com/office/drawing/2014/chartex" xmlns:cx1="http://schemas.microsoft.com/office/drawing/2015/9/8/chartex" xmlns:cx2="http://schemas.microsoft.com/office/drawing/2015/10/21/chartex" xmlns:cx3="http://schemas.microsoft.com/office/drawing/2016/5/9/chartex" xmlns:cx4="http://schemas.microsoft.com/office/drawing/2016/5/10/chartex" xmlns:cx5="http://schemas.microsoft.com/office/drawing/2016/5/11/chartex" xmlns:cx6="http://schemas.microsoft.com/office/drawing/2016/5/12/chartex" xmlns:cx7="http://schemas.microsoft.com/office/drawing/2016/5/13/chartex" xmlns:cx8="http://schemas.microsoft.com/office/drawing/2016/5/14/chartex" xmlns:mc="http://schemas.openxmlformats.org/markup-compatibility/2006" xmlns:aink="http://schemas.microsoft.com/office/drawing/2016/ink" xmlns:am3d="http://schemas.microsoft.com/office/drawing/2017/model3d" xmlns:o="urn:schemas-microsoft-com:office:office" xmlns:oel="http://schemas.microsoft.com/office/2019/extlst" xmlns:r="http://schemas.openxmlformats.org/officeDocument/2006/relationships" xmlns:m="http://schemas.openxmlformats.org/officeDocument/2006/math" xmlns:v="urn:schemas-microsoft-com:vml" xmlns:wp14="http://schemas.microsoft.com/office/word/2010/wordprocessingDrawing" xmlns:wp="http://schemas.openxmlformats.org/drawingml/2006/wordprocessingDrawing" xmlns:w10="urn:schemas-microsoft-com:office:word" xmlns:w="http://schemas.openxmlformats.org/wordprocessingml/2006/main" xmlns:w14="http://schemas.microsoft.com/office/word/2010/wordml" xmlns:w15="http://schemas.microsoft.com/office/word/2012/wordml" xmlns:w16cex="http://schemas.microsoft.com/office/word/2018/wordml/cex" xmlns:w16cid="http://schemas.microsoft.com/office/word/2016/wordml/cid" xmlns:w16="http://schemas.microsoft.com/office/word/2018/wordml" xmlns:w16du="http://schemas.microsoft.com/office/word/2023/wordml/word16du" xmlns:w16sdtdh="http://schemas.microsoft.com/office/word/2020/wordml/sdtdatahash" xmlns:w16sdtfl="http://schemas.microsoft.com/office/word/2024/wordml/sdtformatlock" xmlns:w16se="http://schemas.microsoft.com/office/word/2015/wordml/symex" xmlns:wpg="http://schemas.microsoft.com/office/word/2010/wordprocessingGroup" xmlns:wpi="http://schemas.microsoft.com/office/word/2010/wordprocessingInk" xmlns:wne="http://schemas.microsoft.com/office/word/2006/wordml" xmlns:wps="http://schemas.microsoft.com/office/word/2010/wordprocessingShape" mc:Ignorable="w14 w15 w16se w16cid w16 w16cex w16sdtdh w16sdtfl w16du wp14">
   <w:body>
     <w:p>
       <w:pPr>
@@ -1460,6 +1460,16 @@
                 <w:szCs w:val="16"/>
               </w:rPr>
             </w:pPr>
+            <w:r>
+              <w:rPr>
+                <w:b/>
+                <w:bCs/>
+                <w:color w:val="000000" w:themeColor="text1"/>
+                <w:sz w:val="16"/>
+                <w:szCs w:val="16"/>
+              </w:rPr>
+              <w:t>Me es fácil orquestar soluciones en proyectos que se me plantean, mi problema es que no se me la cantidad de documentación que hay que hacer.</w:t>
+            </w:r>
           </w:p>
         </w:tc>
       </w:tr>
@@ -1617,29 +1627,6 @@
                 <w:szCs w:val="16"/>
               </w:rPr>
             </w:pPr>
-          </w:p>
-        </w:tc>
-      </w:tr>
-      <w:tr>
-        <w:trPr>
-          <w:trHeight w:val="591"/>
-          <w:jc w:val="center"/>
-        </w:trPr>
-        <w:tc>
-          <w:tcPr>
-            <w:tcW w:w="4388" w:type="dxa"/>
-          </w:tcPr>
-          <w:p>
-            <w:pPr>
-              <w:jc w:val="center"/>
-              <w:rPr>
-                <w:b/>
-                <w:bCs/>
-                <w:color w:val="000000" w:themeColor="text1"/>
-                <w:sz w:val="16"/>
-                <w:szCs w:val="16"/>
-              </w:rPr>
-            </w:pPr>
             <w:r>
               <w:rPr>
                 <w:b/>
@@ -1648,755 +1635,7 @@
                 <w:sz w:val="16"/>
                 <w:szCs w:val="16"/>
               </w:rPr>
-              <w:t>Diseñar y adaptar los procesos de ingeniería de requisitos, a través del uso de metodologías de vanguardia y estándares de la industria, para el desarrollo de soluciones TI complejas, innovadoras y de calidad.</w:t>
-            </w:r>
-          </w:p>
-        </w:tc>
-        <w:tc>
-          <w:tcPr>
-            <w:tcW w:w="602" w:type="dxa"/>
-          </w:tcPr>
-          <w:p>
-            <w:pPr>
-              <w:jc w:val="center"/>
-              <w:rPr>
-                <w:b/>
-                <w:bCs/>
-                <w:color w:val="000000" w:themeColor="text1"/>
-                <w:sz w:val="16"/>
-                <w:szCs w:val="16"/>
-              </w:rPr>
-            </w:pPr>
-          </w:p>
-          <w:p>
-            <w:pPr>
-              <w:jc w:val="center"/>
-              <w:rPr>
-                <w:b/>
-                <w:bCs/>
-                <w:color w:val="000000" w:themeColor="text1"/>
-                <w:sz w:val="16"/>
-                <w:szCs w:val="16"/>
-              </w:rPr>
-            </w:pPr>
-            <w:r>
-              <w:rPr>
-                <w:b/>
-                <w:bCs/>
-                <w:color w:val="000000" w:themeColor="text1"/>
-                <w:sz w:val="16"/>
-                <w:szCs w:val="16"/>
-              </w:rPr>
-              <w:t>X</w:t>
-            </w:r>
-          </w:p>
-        </w:tc>
-        <w:tc>
-          <w:tcPr>
-            <w:tcW w:w="603" w:type="dxa"/>
-          </w:tcPr>
-          <w:p>
-            <w:pPr>
-              <w:jc w:val="center"/>
-              <w:rPr>
-                <w:b/>
-                <w:bCs/>
-                <w:color w:val="000000" w:themeColor="text1"/>
-                <w:sz w:val="16"/>
-                <w:szCs w:val="16"/>
-              </w:rPr>
-            </w:pPr>
-          </w:p>
-        </w:tc>
-        <w:tc>
-          <w:tcPr>
-            <w:tcW w:w="603" w:type="dxa"/>
-          </w:tcPr>
-          <w:p>
-            <w:pPr>
-              <w:jc w:val="center"/>
-              <w:rPr>
-                <w:b/>
-                <w:bCs/>
-                <w:color w:val="000000" w:themeColor="text1"/>
-                <w:sz w:val="16"/>
-                <w:szCs w:val="16"/>
-              </w:rPr>
-            </w:pPr>
-          </w:p>
-        </w:tc>
-        <w:tc>
-          <w:tcPr>
-            <w:tcW w:w="603" w:type="dxa"/>
-          </w:tcPr>
-          <w:p>
-            <w:pPr>
-              <w:jc w:val="center"/>
-              <w:rPr>
-                <w:b/>
-                <w:bCs/>
-                <w:color w:val="000000" w:themeColor="text1"/>
-                <w:sz w:val="16"/>
-                <w:szCs w:val="16"/>
-              </w:rPr>
-            </w:pPr>
-          </w:p>
-        </w:tc>
-        <w:tc>
-          <w:tcPr>
-            <w:tcW w:w="603" w:type="dxa"/>
-          </w:tcPr>
-          <w:p>
-            <w:pPr>
-              <w:jc w:val="center"/>
-              <w:rPr>
-                <w:b/>
-                <w:bCs/>
-                <w:color w:val="000000" w:themeColor="text1"/>
-                <w:sz w:val="16"/>
-                <w:szCs w:val="16"/>
-              </w:rPr>
-            </w:pPr>
-          </w:p>
-        </w:tc>
-        <w:tc>
-          <w:tcPr>
-            <w:tcW w:w="2521" w:type="dxa"/>
-          </w:tcPr>
-          <w:p>
-            <w:pPr>
-              <w:jc w:val="center"/>
-              <w:rPr>
-                <w:b/>
-                <w:bCs/>
-                <w:color w:val="000000" w:themeColor="text1"/>
-                <w:sz w:val="16"/>
-                <w:szCs w:val="16"/>
-              </w:rPr>
-            </w:pPr>
-          </w:p>
-        </w:tc>
-      </w:tr>
-      <w:tr>
-        <w:trPr>
-          <w:trHeight w:val="591"/>
-          <w:jc w:val="center"/>
-        </w:trPr>
-        <w:tc>
-          <w:tcPr>
-            <w:tcW w:w="4388" w:type="dxa"/>
-          </w:tcPr>
-          <w:p>
-            <w:pPr>
-              <w:jc w:val="center"/>
-              <w:rPr>
-                <w:b/>
-                <w:bCs/>
-                <w:color w:val="000000" w:themeColor="text1"/>
-                <w:sz w:val="16"/>
-                <w:szCs w:val="16"/>
-              </w:rPr>
-            </w:pPr>
-            <w:r>
-              <w:rPr>
-                <w:b/>
-                <w:bCs/>
-                <w:color w:val="000000" w:themeColor="text1"/>
-                <w:sz w:val="16"/>
-                <w:szCs w:val="16"/>
-              </w:rPr>
-              <w:t>Evaluar y gestionar proyectos en su área de especialización profesional, durante todo el ciclo de vida, de acuerdo a buenas prácticas y utilizando metodologías y herramientas de software, para cumplir con los requerimientos de la organización en contextos tradicionales y ágiles.</w:t>
-            </w:r>
-          </w:p>
-        </w:tc>
-        <w:tc>
-          <w:tcPr>
-            <w:tcW w:w="602" w:type="dxa"/>
-          </w:tcPr>
-          <w:p>
-            <w:pPr>
-              <w:jc w:val="center"/>
-              <w:rPr>
-                <w:b/>
-                <w:bCs/>
-                <w:color w:val="000000" w:themeColor="text1"/>
-                <w:sz w:val="16"/>
-                <w:szCs w:val="16"/>
-              </w:rPr>
-            </w:pPr>
-          </w:p>
-          <w:p>
-            <w:pPr>
-              <w:jc w:val="center"/>
-              <w:rPr>
-                <w:b/>
-                <w:bCs/>
-                <w:color w:val="000000" w:themeColor="text1"/>
-                <w:sz w:val="16"/>
-                <w:szCs w:val="16"/>
-              </w:rPr>
-            </w:pPr>
-          </w:p>
-          <w:p>
-            <w:pPr>
-              <w:jc w:val="center"/>
-              <w:rPr>
-                <w:b/>
-                <w:bCs/>
-                <w:color w:val="000000" w:themeColor="text1"/>
-                <w:sz w:val="16"/>
-                <w:szCs w:val="16"/>
-              </w:rPr>
-            </w:pPr>
-            <w:r>
-              <w:rPr>
-                <w:b/>
-                <w:bCs/>
-                <w:color w:val="000000" w:themeColor="text1"/>
-                <w:sz w:val="16"/>
-                <w:szCs w:val="16"/>
-              </w:rPr>
-              <w:t>X</w:t>
-            </w:r>
-          </w:p>
-        </w:tc>
-        <w:tc>
-          <w:tcPr>
-            <w:tcW w:w="603" w:type="dxa"/>
-          </w:tcPr>
-          <w:p>
-            <w:pPr>
-              <w:jc w:val="center"/>
-              <w:rPr>
-                <w:b/>
-                <w:bCs/>
-                <w:color w:val="000000" w:themeColor="text1"/>
-                <w:sz w:val="16"/>
-                <w:szCs w:val="16"/>
-              </w:rPr>
-            </w:pPr>
-          </w:p>
-        </w:tc>
-        <w:tc>
-          <w:tcPr>
-            <w:tcW w:w="603" w:type="dxa"/>
-          </w:tcPr>
-          <w:p>
-            <w:pPr>
-              <w:jc w:val="center"/>
-              <w:rPr>
-                <w:b/>
-                <w:bCs/>
-                <w:color w:val="000000" w:themeColor="text1"/>
-                <w:sz w:val="16"/>
-                <w:szCs w:val="16"/>
-              </w:rPr>
-            </w:pPr>
-          </w:p>
-        </w:tc>
-        <w:tc>
-          <w:tcPr>
-            <w:tcW w:w="603" w:type="dxa"/>
-          </w:tcPr>
-          <w:p>
-            <w:pPr>
-              <w:jc w:val="center"/>
-              <w:rPr>
-                <w:b/>
-                <w:bCs/>
-                <w:color w:val="000000" w:themeColor="text1"/>
-                <w:sz w:val="16"/>
-                <w:szCs w:val="16"/>
-              </w:rPr>
-            </w:pPr>
-          </w:p>
-        </w:tc>
-        <w:tc>
-          <w:tcPr>
-            <w:tcW w:w="603" w:type="dxa"/>
-          </w:tcPr>
-          <w:p>
-            <w:pPr>
-              <w:jc w:val="center"/>
-              <w:rPr>
-                <w:b/>
-                <w:bCs/>
-                <w:color w:val="000000" w:themeColor="text1"/>
-                <w:sz w:val="16"/>
-                <w:szCs w:val="16"/>
-              </w:rPr>
-            </w:pPr>
-          </w:p>
-        </w:tc>
-        <w:tc>
-          <w:tcPr>
-            <w:tcW w:w="2521" w:type="dxa"/>
-          </w:tcPr>
-          <w:p>
-            <w:pPr>
-              <w:jc w:val="center"/>
-              <w:rPr>
-                <w:b/>
-                <w:bCs/>
-                <w:color w:val="000000" w:themeColor="text1"/>
-                <w:sz w:val="16"/>
-                <w:szCs w:val="16"/>
-              </w:rPr>
-            </w:pPr>
-          </w:p>
-        </w:tc>
-      </w:tr>
-      <w:tr>
-        <w:trPr>
-          <w:trHeight w:val="591"/>
-          <w:jc w:val="center"/>
-        </w:trPr>
-        <w:tc>
-          <w:tcPr>
-            <w:tcW w:w="4388" w:type="dxa"/>
-          </w:tcPr>
-          <w:p>
-            <w:pPr>
-              <w:jc w:val="center"/>
-              <w:rPr>
-                <w:b/>
-                <w:bCs/>
-                <w:color w:val="000000" w:themeColor="text1"/>
-                <w:sz w:val="16"/>
-                <w:szCs w:val="16"/>
-              </w:rPr>
-            </w:pPr>
-            <w:r>
-              <w:rPr>
-                <w:b/>
-                <w:bCs/>
-                <w:color w:val="000000" w:themeColor="text1"/>
-                <w:sz w:val="16"/>
-                <w:szCs w:val="16"/>
-              </w:rPr>
-              <w:t>Diseñar soluciones de software, abarcando todo el ciclo de vida de éste, de acuerdo a estándares, marcos de trabajo y regulatorios, tecnologías y metodologías que promueven la innovación, con foco en la calidad, seguridad y sostenibilidad del proyecto.</w:t>
-            </w:r>
-          </w:p>
-        </w:tc>
-        <w:tc>
-          <w:tcPr>
-            <w:tcW w:w="602" w:type="dxa"/>
-          </w:tcPr>
-          <w:p>
-            <w:pPr>
-              <w:jc w:val="center"/>
-              <w:rPr>
-                <w:b/>
-                <w:bCs/>
-                <w:color w:val="000000" w:themeColor="text1"/>
-                <w:sz w:val="16"/>
-                <w:szCs w:val="16"/>
-              </w:rPr>
-            </w:pPr>
-          </w:p>
-          <w:p>
-            <w:pPr>
-              <w:jc w:val="center"/>
-              <w:rPr>
-                <w:b/>
-                <w:bCs/>
-                <w:color w:val="000000" w:themeColor="text1"/>
-                <w:sz w:val="16"/>
-                <w:szCs w:val="16"/>
-              </w:rPr>
-            </w:pPr>
-          </w:p>
-          <w:p>
-            <w:pPr>
-              <w:jc w:val="center"/>
-              <w:rPr>
-                <w:b/>
-                <w:bCs/>
-                <w:color w:val="000000" w:themeColor="text1"/>
-                <w:sz w:val="16"/>
-                <w:szCs w:val="16"/>
-              </w:rPr>
-            </w:pPr>
-          </w:p>
-        </w:tc>
-        <w:tc>
-          <w:tcPr>
-            <w:tcW w:w="603" w:type="dxa"/>
-          </w:tcPr>
-          <w:p>
-            <w:pPr>
-              <w:jc w:val="center"/>
-              <w:rPr>
-                <w:b/>
-                <w:bCs/>
-                <w:color w:val="000000" w:themeColor="text1"/>
-                <w:sz w:val="16"/>
-                <w:szCs w:val="16"/>
-              </w:rPr>
-            </w:pPr>
-          </w:p>
-          <w:p>
-            <w:pPr>
-              <w:jc w:val="center"/>
-              <w:rPr>
-                <w:b/>
-                <w:bCs/>
-                <w:color w:val="000000" w:themeColor="text1"/>
-                <w:sz w:val="16"/>
-                <w:szCs w:val="16"/>
-              </w:rPr>
-            </w:pPr>
-          </w:p>
-          <w:p>
-            <w:pPr>
-              <w:jc w:val="center"/>
-              <w:rPr>
-                <w:b/>
-                <w:bCs/>
-                <w:color w:val="000000" w:themeColor="text1"/>
-                <w:sz w:val="16"/>
-                <w:szCs w:val="16"/>
-              </w:rPr>
-            </w:pPr>
-            <w:r>
-              <w:rPr>
-                <w:b/>
-                <w:bCs/>
-                <w:color w:val="000000" w:themeColor="text1"/>
-                <w:sz w:val="16"/>
-                <w:szCs w:val="16"/>
-              </w:rPr>
-              <w:t>X</w:t>
-            </w:r>
-          </w:p>
-        </w:tc>
-        <w:tc>
-          <w:tcPr>
-            <w:tcW w:w="603" w:type="dxa"/>
-          </w:tcPr>
-          <w:p>
-            <w:pPr>
-              <w:jc w:val="center"/>
-              <w:rPr>
-                <w:b/>
-                <w:bCs/>
-                <w:color w:val="000000" w:themeColor="text1"/>
-                <w:sz w:val="16"/>
-                <w:szCs w:val="16"/>
-              </w:rPr>
-            </w:pPr>
-          </w:p>
-        </w:tc>
-        <w:tc>
-          <w:tcPr>
-            <w:tcW w:w="603" w:type="dxa"/>
-          </w:tcPr>
-          <w:p>
-            <w:pPr>
-              <w:jc w:val="center"/>
-              <w:rPr>
-                <w:b/>
-                <w:bCs/>
-                <w:color w:val="000000" w:themeColor="text1"/>
-                <w:sz w:val="16"/>
-                <w:szCs w:val="16"/>
-              </w:rPr>
-            </w:pPr>
-          </w:p>
-        </w:tc>
-        <w:tc>
-          <w:tcPr>
-            <w:tcW w:w="603" w:type="dxa"/>
-          </w:tcPr>
-          <w:p>
-            <w:pPr>
-              <w:jc w:val="center"/>
-              <w:rPr>
-                <w:b/>
-                <w:bCs/>
-                <w:color w:val="000000" w:themeColor="text1"/>
-                <w:sz w:val="16"/>
-                <w:szCs w:val="16"/>
-              </w:rPr>
-            </w:pPr>
-          </w:p>
-        </w:tc>
-        <w:tc>
-          <w:tcPr>
-            <w:tcW w:w="2521" w:type="dxa"/>
-          </w:tcPr>
-          <w:p>
-            <w:pPr>
-              <w:jc w:val="center"/>
-              <w:rPr>
-                <w:b/>
-                <w:bCs/>
-                <w:color w:val="000000" w:themeColor="text1"/>
-                <w:sz w:val="16"/>
-                <w:szCs w:val="16"/>
-              </w:rPr>
-            </w:pPr>
-          </w:p>
-        </w:tc>
-      </w:tr>
-      <w:tr>
-        <w:trPr>
-          <w:trHeight w:val="576"/>
-          <w:jc w:val="center"/>
-        </w:trPr>
-        <w:tc>
-          <w:tcPr>
-            <w:tcW w:w="4388" w:type="dxa"/>
-          </w:tcPr>
-          <w:p>
-            <w:pPr>
-              <w:jc w:val="center"/>
-              <w:rPr>
-                <w:b/>
-                <w:bCs/>
-                <w:color w:val="000000" w:themeColor="text1"/>
-                <w:sz w:val="16"/>
-                <w:szCs w:val="16"/>
-              </w:rPr>
-            </w:pPr>
-            <w:r>
-              <w:rPr>
-                <w:b/>
-                <w:bCs/>
-                <w:color w:val="000000" w:themeColor="text1"/>
-                <w:sz w:val="16"/>
-                <w:szCs w:val="16"/>
-              </w:rPr>
-              <w:t>Desarrollar proyectos de software innovadores para plataformas y dispositivos móviles, por medio de marcos de trabajo, herramientas de desarrollo, lenguajes de programación y buenas prácticas de la industria del desarrollo de software.</w:t>
-            </w:r>
-          </w:p>
-        </w:tc>
-        <w:tc>
-          <w:tcPr>
-            <w:tcW w:w="602" w:type="dxa"/>
-          </w:tcPr>
-          <w:p>
-            <w:pPr>
-              <w:jc w:val="center"/>
-              <w:rPr>
-                <w:b/>
-                <w:bCs/>
-                <w:color w:val="000000" w:themeColor="text1"/>
-                <w:sz w:val="16"/>
-                <w:szCs w:val="16"/>
-              </w:rPr>
-            </w:pPr>
-          </w:p>
-        </w:tc>
-        <w:tc>
-          <w:tcPr>
-            <w:tcW w:w="603" w:type="dxa"/>
-          </w:tcPr>
-          <w:p>
-            <w:pPr>
-              <w:jc w:val="center"/>
-              <w:rPr>
-                <w:b/>
-                <w:bCs/>
-                <w:color w:val="000000" w:themeColor="text1"/>
-                <w:sz w:val="16"/>
-                <w:szCs w:val="16"/>
-              </w:rPr>
-            </w:pPr>
-          </w:p>
-        </w:tc>
-        <w:tc>
-          <w:tcPr>
-            <w:tcW w:w="603" w:type="dxa"/>
-          </w:tcPr>
-          <w:p>
-            <w:pPr>
-              <w:jc w:val="center"/>
-              <w:rPr>
-                <w:b/>
-                <w:bCs/>
-                <w:color w:val="000000" w:themeColor="text1"/>
-                <w:sz w:val="16"/>
-                <w:szCs w:val="16"/>
-              </w:rPr>
-            </w:pPr>
-          </w:p>
-          <w:p>
-            <w:pPr>
-              <w:jc w:val="center"/>
-              <w:rPr>
-                <w:b/>
-                <w:bCs/>
-                <w:color w:val="000000" w:themeColor="text1"/>
-                <w:sz w:val="16"/>
-                <w:szCs w:val="16"/>
-              </w:rPr>
-            </w:pPr>
-          </w:p>
-          <w:p>
-            <w:pPr>
-              <w:jc w:val="center"/>
-              <w:rPr>
-                <w:b/>
-                <w:bCs/>
-                <w:color w:val="000000" w:themeColor="text1"/>
-                <w:sz w:val="16"/>
-                <w:szCs w:val="16"/>
-              </w:rPr>
-            </w:pPr>
-            <w:r>
-              <w:rPr>
-                <w:b/>
-                <w:bCs/>
-                <w:color w:val="000000" w:themeColor="text1"/>
-                <w:sz w:val="16"/>
-                <w:szCs w:val="16"/>
-              </w:rPr>
-              <w:t>X</w:t>
-            </w:r>
-          </w:p>
-        </w:tc>
-        <w:tc>
-          <w:tcPr>
-            <w:tcW w:w="603" w:type="dxa"/>
-          </w:tcPr>
-          <w:p>
-            <w:pPr>
-              <w:jc w:val="center"/>
-              <w:rPr>
-                <w:b/>
-                <w:bCs/>
-                <w:color w:val="000000" w:themeColor="text1"/>
-                <w:sz w:val="16"/>
-                <w:szCs w:val="16"/>
-              </w:rPr>
-            </w:pPr>
-          </w:p>
-          <w:p>
-            <w:pPr>
-              <w:jc w:val="center"/>
-              <w:rPr>
-                <w:b/>
-                <w:bCs/>
-                <w:color w:val="000000" w:themeColor="text1"/>
-                <w:sz w:val="16"/>
-                <w:szCs w:val="16"/>
-              </w:rPr>
-            </w:pPr>
-          </w:p>
-          <w:p>
-            <w:pPr>
-              <w:rPr>
-                <w:b/>
-                <w:bCs/>
-                <w:color w:val="000000" w:themeColor="text1"/>
-                <w:sz w:val="16"/>
-                <w:szCs w:val="16"/>
-              </w:rPr>
-            </w:pPr>
-          </w:p>
-        </w:tc>
-        <w:tc>
-          <w:tcPr>
-            <w:tcW w:w="603" w:type="dxa"/>
-          </w:tcPr>
-          <w:p>
-            <w:pPr>
-              <w:jc w:val="center"/>
-              <w:rPr>
-                <w:b/>
-                <w:bCs/>
-                <w:color w:val="000000" w:themeColor="text1"/>
-                <w:sz w:val="16"/>
-                <w:szCs w:val="16"/>
-              </w:rPr>
-            </w:pPr>
-          </w:p>
-        </w:tc>
-        <w:tc>
-          <w:tcPr>
-            <w:tcW w:w="2521" w:type="dxa"/>
-          </w:tcPr>
-          <w:p>
-            <w:pPr>
-              <w:jc w:val="center"/>
-              <w:rPr>
-                <w:b/>
-                <w:bCs/>
-                <w:color w:val="000000" w:themeColor="text1"/>
-                <w:sz w:val="16"/>
-                <w:szCs w:val="16"/>
-              </w:rPr>
-            </w:pPr>
-            <w:r>
-              <w:rPr>
-                <w:b/>
-                <w:bCs/>
-                <w:color w:val="000000" w:themeColor="text1"/>
-                <w:sz w:val="16"/>
-                <w:szCs w:val="16"/>
-              </w:rPr>
-              <w:t>Principalmente</w:t>
-            </w:r>
-            <w:r>
-              <w:rPr>
-                <w:b/>
-                <w:bCs/>
-                <w:color w:val="000000" w:themeColor="text1"/>
-                <w:sz w:val="16"/>
-                <w:szCs w:val="16"/>
-              </w:rPr>
-              <w:t>,</w:t>
-            </w:r>
-            <w:r>
-              <w:rPr>
-                <w:b/>
-                <w:bCs/>
-                <w:color w:val="000000" w:themeColor="text1"/>
-                <w:sz w:val="16"/>
-                <w:szCs w:val="16"/>
-              </w:rPr>
-              <w:t xml:space="preserve"> siento que en esto mi conocimiento es bastante básico porque no recuerdo mucho de lo hecho en la programación de app móvil</w:t>
-            </w:r>
-            <w:r>
-              <w:rPr>
-                <w:b/>
-                <w:bCs/>
-                <w:color w:val="000000" w:themeColor="text1"/>
-                <w:sz w:val="16"/>
-                <w:szCs w:val="16"/>
-              </w:rPr>
-              <w:t xml:space="preserve"> y</w:t>
-            </w:r>
-            <w:r>
-              <w:rPr>
-                <w:b/>
-                <w:bCs/>
-                <w:color w:val="000000" w:themeColor="text1"/>
-                <w:sz w:val="16"/>
-                <w:szCs w:val="16"/>
-              </w:rPr>
-              <w:t>,</w:t>
-            </w:r>
-            <w:r>
-              <w:rPr>
-                <w:b/>
-                <w:bCs/>
-                <w:color w:val="000000" w:themeColor="text1"/>
-                <w:sz w:val="16"/>
-                <w:szCs w:val="16"/>
-              </w:rPr>
-              <w:t xml:space="preserve"> desde que lo vimos, nunca más recuerdo haberlo puesto en práctica</w:t>
-            </w:r>
-            <w:r>
-              <w:rPr>
-                <w:b/>
-                <w:bCs/>
-                <w:color w:val="000000" w:themeColor="text1"/>
-                <w:sz w:val="16"/>
-                <w:szCs w:val="16"/>
-              </w:rPr>
-              <w:t>, nada más.</w:t>
+              <w:t>Lo mismo de arriba, mas fácil aun si lo que pide el cliente o el proyecto esta bien explicado</w:t>
             </w:r>
           </w:p>
         </w:tc>
@@ -2429,7 +1668,7 @@
                 <w:sz w:val="16"/>
                 <w:szCs w:val="16"/>
               </w:rPr>
-              <w:t>Diseñar y generar soluciones que permitan resolver los requerimientos de información en el contexto de las organizaciones, considerando bases de datos relacionales y no relacionales.</w:t>
+              <w:t>Diseñar y adaptar los procesos de ingeniería de requisitos, a través del uso de metodologías de vanguardia y estándares de la industria, para el desarrollo de soluciones TI complejas, innovadoras y de calidad.</w:t>
             </w:r>
           </w:p>
         </w:tc>
@@ -2449,11 +1688,6 @@
               </w:rPr>
             </w:pPr>
           </w:p>
-        </w:tc>
-        <w:tc>
-          <w:tcPr>
-            <w:tcW w:w="603" w:type="dxa"/>
-          </w:tcPr>
           <w:p>
             <w:pPr>
               <w:jc w:val="center"/>
@@ -2465,17 +1699,6 @@
                 <w:szCs w:val="16"/>
               </w:rPr>
             </w:pPr>
-          </w:p>
-          <w:p>
-            <w:pPr>
-              <w:rPr>
-                <w:b/>
-                <w:bCs/>
-                <w:color w:val="000000" w:themeColor="text1"/>
-                <w:sz w:val="16"/>
-                <w:szCs w:val="16"/>
-              </w:rPr>
-            </w:pPr>
             <w:r>
               <w:rPr>
                 <w:b/>
@@ -2484,7 +1707,7 @@
                 <w:sz w:val="16"/>
                 <w:szCs w:val="16"/>
               </w:rPr>
-              <w:t xml:space="preserve">    X</w:t>
+              <w:t>X</w:t>
             </w:r>
           </w:p>
         </w:tc>
@@ -2541,6 +1764,23 @@
         </w:tc>
         <w:tc>
           <w:tcPr>
+            <w:tcW w:w="603" w:type="dxa"/>
+          </w:tcPr>
+          <w:p>
+            <w:pPr>
+              <w:jc w:val="center"/>
+              <w:rPr>
+                <w:b/>
+                <w:bCs/>
+                <w:color w:val="000000" w:themeColor="text1"/>
+                <w:sz w:val="16"/>
+                <w:szCs w:val="16"/>
+              </w:rPr>
+            </w:pPr>
+          </w:p>
+        </w:tc>
+        <w:tc>
+          <w:tcPr>
             <w:tcW w:w="2521" w:type="dxa"/>
           </w:tcPr>
           <w:p>
@@ -2554,6 +1794,408 @@
                 <w:szCs w:val="16"/>
               </w:rPr>
             </w:pPr>
+            <w:r>
+              <w:rPr>
+                <w:b/>
+                <w:bCs/>
+                <w:color w:val="000000" w:themeColor="text1"/>
+                <w:sz w:val="16"/>
+                <w:szCs w:val="16"/>
+              </w:rPr>
+              <w:t>Mas documentos y tomas de decisiones, me gusta hacer documentos.</w:t>
+            </w:r>
+          </w:p>
+        </w:tc>
+      </w:tr>
+      <w:tr>
+        <w:trPr>
+          <w:trHeight w:val="591"/>
+          <w:jc w:val="center"/>
+        </w:trPr>
+        <w:tc>
+          <w:tcPr>
+            <w:tcW w:w="4388" w:type="dxa"/>
+          </w:tcPr>
+          <w:p>
+            <w:pPr>
+              <w:jc w:val="center"/>
+              <w:rPr>
+                <w:b/>
+                <w:bCs/>
+                <w:color w:val="000000" w:themeColor="text1"/>
+                <w:sz w:val="16"/>
+                <w:szCs w:val="16"/>
+              </w:rPr>
+            </w:pPr>
+            <w:r>
+              <w:rPr>
+                <w:b/>
+                <w:bCs/>
+                <w:color w:val="000000" w:themeColor="text1"/>
+                <w:sz w:val="16"/>
+                <w:szCs w:val="16"/>
+              </w:rPr>
+              <w:t>Evaluar y gestionar proyectos en su área de especialización profesional, durante todo el ciclo de vida, de acuerdo a buenas prácticas y utilizando metodologías y herramientas de software, para cumplir con los requerimientos de la organización en contextos tradicionales y ágiles.</w:t>
+            </w:r>
+          </w:p>
+        </w:tc>
+        <w:tc>
+          <w:tcPr>
+            <w:tcW w:w="602" w:type="dxa"/>
+          </w:tcPr>
+          <w:p>
+            <w:pPr>
+              <w:jc w:val="center"/>
+              <w:rPr>
+                <w:b/>
+                <w:bCs/>
+                <w:color w:val="000000" w:themeColor="text1"/>
+                <w:sz w:val="16"/>
+                <w:szCs w:val="16"/>
+              </w:rPr>
+            </w:pPr>
+          </w:p>
+          <w:p>
+            <w:pPr>
+              <w:jc w:val="center"/>
+              <w:rPr>
+                <w:b/>
+                <w:bCs/>
+                <w:color w:val="000000" w:themeColor="text1"/>
+                <w:sz w:val="16"/>
+                <w:szCs w:val="16"/>
+              </w:rPr>
+            </w:pPr>
+          </w:p>
+          <w:p>
+            <w:pPr>
+              <w:jc w:val="center"/>
+              <w:rPr>
+                <w:b/>
+                <w:bCs/>
+                <w:color w:val="000000" w:themeColor="text1"/>
+                <w:sz w:val="16"/>
+                <w:szCs w:val="16"/>
+              </w:rPr>
+            </w:pPr>
+            <w:r>
+              <w:rPr>
+                <w:b/>
+                <w:bCs/>
+                <w:color w:val="000000" w:themeColor="text1"/>
+                <w:sz w:val="16"/>
+                <w:szCs w:val="16"/>
+              </w:rPr>
+              <w:t>X</w:t>
+            </w:r>
+          </w:p>
+        </w:tc>
+        <w:tc>
+          <w:tcPr>
+            <w:tcW w:w="603" w:type="dxa"/>
+          </w:tcPr>
+          <w:p>
+            <w:pPr>
+              <w:jc w:val="center"/>
+              <w:rPr>
+                <w:b/>
+                <w:bCs/>
+                <w:color w:val="000000" w:themeColor="text1"/>
+                <w:sz w:val="16"/>
+                <w:szCs w:val="16"/>
+              </w:rPr>
+            </w:pPr>
+          </w:p>
+        </w:tc>
+        <w:tc>
+          <w:tcPr>
+            <w:tcW w:w="603" w:type="dxa"/>
+          </w:tcPr>
+          <w:p>
+            <w:pPr>
+              <w:jc w:val="center"/>
+              <w:rPr>
+                <w:b/>
+                <w:bCs/>
+                <w:color w:val="000000" w:themeColor="text1"/>
+                <w:sz w:val="16"/>
+                <w:szCs w:val="16"/>
+              </w:rPr>
+            </w:pPr>
+          </w:p>
+        </w:tc>
+        <w:tc>
+          <w:tcPr>
+            <w:tcW w:w="603" w:type="dxa"/>
+          </w:tcPr>
+          <w:p>
+            <w:pPr>
+              <w:jc w:val="center"/>
+              <w:rPr>
+                <w:b/>
+                <w:bCs/>
+                <w:color w:val="000000" w:themeColor="text1"/>
+                <w:sz w:val="16"/>
+                <w:szCs w:val="16"/>
+              </w:rPr>
+            </w:pPr>
+          </w:p>
+        </w:tc>
+        <w:tc>
+          <w:tcPr>
+            <w:tcW w:w="603" w:type="dxa"/>
+          </w:tcPr>
+          <w:p>
+            <w:pPr>
+              <w:jc w:val="center"/>
+              <w:rPr>
+                <w:b/>
+                <w:bCs/>
+                <w:color w:val="000000" w:themeColor="text1"/>
+                <w:sz w:val="16"/>
+                <w:szCs w:val="16"/>
+              </w:rPr>
+            </w:pPr>
+          </w:p>
+        </w:tc>
+        <w:tc>
+          <w:tcPr>
+            <w:tcW w:w="2521" w:type="dxa"/>
+          </w:tcPr>
+          <w:p>
+            <w:pPr>
+              <w:jc w:val="center"/>
+              <w:rPr>
+                <w:b/>
+                <w:bCs/>
+                <w:color w:val="000000" w:themeColor="text1"/>
+                <w:sz w:val="16"/>
+                <w:szCs w:val="16"/>
+              </w:rPr>
+            </w:pPr>
+            <w:r>
+              <w:rPr>
+                <w:b/>
+                <w:bCs/>
+                <w:color w:val="000000" w:themeColor="text1"/>
+                <w:sz w:val="16"/>
+                <w:szCs w:val="16"/>
+              </w:rPr>
+              <w:t>Si lo que pide el proyecto esta bien detallado o la búsqueda de dicha información no es complicada por X o Y motivo, esto se hace fácil.</w:t>
+            </w:r>
+          </w:p>
+        </w:tc>
+      </w:tr>
+      <w:tr>
+        <w:trPr>
+          <w:trHeight w:val="591"/>
+          <w:jc w:val="center"/>
+        </w:trPr>
+        <w:tc>
+          <w:tcPr>
+            <w:tcW w:w="4388" w:type="dxa"/>
+          </w:tcPr>
+          <w:p>
+            <w:pPr>
+              <w:jc w:val="center"/>
+              <w:rPr>
+                <w:b/>
+                <w:bCs/>
+                <w:color w:val="000000" w:themeColor="text1"/>
+                <w:sz w:val="16"/>
+                <w:szCs w:val="16"/>
+              </w:rPr>
+            </w:pPr>
+            <w:r>
+              <w:rPr>
+                <w:b/>
+                <w:bCs/>
+                <w:color w:val="000000" w:themeColor="text1"/>
+                <w:sz w:val="16"/>
+                <w:szCs w:val="16"/>
+              </w:rPr>
+              <w:t>Diseñar soluciones de software, abarcando todo el ciclo de vida de éste, de acuerdo a estándares, marcos de trabajo y regulatorios, tecnologías y metodologías que promueven la innovación, con foco en la calidad, seguridad y sostenibilidad del proyecto.</w:t>
+            </w:r>
+          </w:p>
+        </w:tc>
+        <w:tc>
+          <w:tcPr>
+            <w:tcW w:w="602" w:type="dxa"/>
+          </w:tcPr>
+          <w:p>
+            <w:pPr>
+              <w:jc w:val="center"/>
+              <w:rPr>
+                <w:b/>
+                <w:bCs/>
+                <w:color w:val="000000" w:themeColor="text1"/>
+                <w:sz w:val="16"/>
+                <w:szCs w:val="16"/>
+              </w:rPr>
+            </w:pPr>
+          </w:p>
+          <w:p>
+            <w:pPr>
+              <w:jc w:val="center"/>
+              <w:rPr>
+                <w:b/>
+                <w:bCs/>
+                <w:color w:val="000000" w:themeColor="text1"/>
+                <w:sz w:val="16"/>
+                <w:szCs w:val="16"/>
+              </w:rPr>
+            </w:pPr>
+          </w:p>
+          <w:p>
+            <w:pPr>
+              <w:jc w:val="center"/>
+              <w:rPr>
+                <w:b/>
+                <w:bCs/>
+                <w:color w:val="000000" w:themeColor="text1"/>
+                <w:sz w:val="16"/>
+                <w:szCs w:val="16"/>
+              </w:rPr>
+            </w:pPr>
+          </w:p>
+        </w:tc>
+        <w:tc>
+          <w:tcPr>
+            <w:tcW w:w="603" w:type="dxa"/>
+          </w:tcPr>
+          <w:p>
+            <w:pPr>
+              <w:jc w:val="center"/>
+              <w:rPr>
+                <w:b/>
+                <w:bCs/>
+                <w:color w:val="000000" w:themeColor="text1"/>
+                <w:sz w:val="16"/>
+                <w:szCs w:val="16"/>
+              </w:rPr>
+            </w:pPr>
+          </w:p>
+          <w:p>
+            <w:pPr>
+              <w:jc w:val="center"/>
+              <w:rPr>
+                <w:b/>
+                <w:bCs/>
+                <w:color w:val="000000" w:themeColor="text1"/>
+                <w:sz w:val="16"/>
+                <w:szCs w:val="16"/>
+              </w:rPr>
+            </w:pPr>
+          </w:p>
+          <w:p>
+            <w:pPr>
+              <w:jc w:val="center"/>
+              <w:rPr>
+                <w:b/>
+                <w:bCs/>
+                <w:color w:val="000000" w:themeColor="text1"/>
+                <w:sz w:val="16"/>
+                <w:szCs w:val="16"/>
+              </w:rPr>
+            </w:pPr>
+            <w:r>
+              <w:rPr>
+                <w:b/>
+                <w:bCs/>
+                <w:color w:val="000000" w:themeColor="text1"/>
+                <w:sz w:val="16"/>
+                <w:szCs w:val="16"/>
+              </w:rPr>
+              <w:t>X</w:t>
+            </w:r>
+          </w:p>
+        </w:tc>
+        <w:tc>
+          <w:tcPr>
+            <w:tcW w:w="603" w:type="dxa"/>
+          </w:tcPr>
+          <w:p>
+            <w:pPr>
+              <w:jc w:val="center"/>
+              <w:rPr>
+                <w:b/>
+                <w:bCs/>
+                <w:color w:val="000000" w:themeColor="text1"/>
+                <w:sz w:val="16"/>
+                <w:szCs w:val="16"/>
+              </w:rPr>
+            </w:pPr>
+          </w:p>
+        </w:tc>
+        <w:tc>
+          <w:tcPr>
+            <w:tcW w:w="603" w:type="dxa"/>
+          </w:tcPr>
+          <w:p>
+            <w:pPr>
+              <w:jc w:val="center"/>
+              <w:rPr>
+                <w:b/>
+                <w:bCs/>
+                <w:color w:val="000000" w:themeColor="text1"/>
+                <w:sz w:val="16"/>
+                <w:szCs w:val="16"/>
+              </w:rPr>
+            </w:pPr>
+          </w:p>
+        </w:tc>
+        <w:tc>
+          <w:tcPr>
+            <w:tcW w:w="603" w:type="dxa"/>
+          </w:tcPr>
+          <w:p>
+            <w:pPr>
+              <w:jc w:val="center"/>
+              <w:rPr>
+                <w:b/>
+                <w:bCs/>
+                <w:color w:val="000000" w:themeColor="text1"/>
+                <w:sz w:val="16"/>
+                <w:szCs w:val="16"/>
+              </w:rPr>
+            </w:pPr>
+          </w:p>
+        </w:tc>
+        <w:tc>
+          <w:tcPr>
+            <w:tcW w:w="2521" w:type="dxa"/>
+          </w:tcPr>
+          <w:p>
+            <w:pPr>
+              <w:jc w:val="center"/>
+              <w:rPr>
+                <w:b/>
+                <w:bCs/>
+                <w:color w:val="000000" w:themeColor="text1"/>
+                <w:sz w:val="16"/>
+                <w:szCs w:val="16"/>
+              </w:rPr>
+            </w:pPr>
+            <w:r>
+              <w:rPr>
+                <w:b/>
+                <w:bCs/>
+                <w:color w:val="000000" w:themeColor="text1"/>
+                <w:sz w:val="16"/>
+                <w:szCs w:val="16"/>
+              </w:rPr>
+              <w:t>Me es fácil orquestar soluciones en proyectos que se me plantean</w:t>
+            </w:r>
+            <w:r>
+              <w:rPr>
+                <w:b/>
+                <w:bCs/>
+                <w:color w:val="000000" w:themeColor="text1"/>
+                <w:sz w:val="16"/>
+                <w:szCs w:val="16"/>
+              </w:rPr>
+              <w:t xml:space="preserve"> pero el hecho de innovar pide un poco más, innovar no se me da del todo bien.</w:t>
+            </w:r>
           </w:p>
         </w:tc>
       </w:tr>
@@ -2585,6 +2227,404 @@
                 <w:sz w:val="16"/>
                 <w:szCs w:val="16"/>
               </w:rPr>
+              <w:t>Desarrollar proyectos de software innovadores para plataformas y dispositivos móviles, por medio de marcos de trabajo, herramientas de desarrollo, lenguajes de programación y buenas prácticas de la industria del desarrollo de software.</w:t>
+            </w:r>
+          </w:p>
+        </w:tc>
+        <w:tc>
+          <w:tcPr>
+            <w:tcW w:w="602" w:type="dxa"/>
+          </w:tcPr>
+          <w:p>
+            <w:pPr>
+              <w:jc w:val="center"/>
+              <w:rPr>
+                <w:b/>
+                <w:bCs/>
+                <w:color w:val="000000" w:themeColor="text1"/>
+                <w:sz w:val="16"/>
+                <w:szCs w:val="16"/>
+              </w:rPr>
+            </w:pPr>
+          </w:p>
+        </w:tc>
+        <w:tc>
+          <w:tcPr>
+            <w:tcW w:w="603" w:type="dxa"/>
+          </w:tcPr>
+          <w:p>
+            <w:pPr>
+              <w:jc w:val="center"/>
+              <w:rPr>
+                <w:b/>
+                <w:bCs/>
+                <w:color w:val="000000" w:themeColor="text1"/>
+                <w:sz w:val="16"/>
+                <w:szCs w:val="16"/>
+              </w:rPr>
+            </w:pPr>
+          </w:p>
+        </w:tc>
+        <w:tc>
+          <w:tcPr>
+            <w:tcW w:w="603" w:type="dxa"/>
+          </w:tcPr>
+          <w:p>
+            <w:pPr>
+              <w:jc w:val="center"/>
+              <w:rPr>
+                <w:b/>
+                <w:bCs/>
+                <w:color w:val="000000" w:themeColor="text1"/>
+                <w:sz w:val="16"/>
+                <w:szCs w:val="16"/>
+              </w:rPr>
+            </w:pPr>
+          </w:p>
+          <w:p>
+            <w:pPr>
+              <w:jc w:val="center"/>
+              <w:rPr>
+                <w:b/>
+                <w:bCs/>
+                <w:color w:val="000000" w:themeColor="text1"/>
+                <w:sz w:val="16"/>
+                <w:szCs w:val="16"/>
+              </w:rPr>
+            </w:pPr>
+          </w:p>
+          <w:p>
+            <w:pPr>
+              <w:jc w:val="center"/>
+              <w:rPr>
+                <w:b/>
+                <w:bCs/>
+                <w:color w:val="000000" w:themeColor="text1"/>
+                <w:sz w:val="16"/>
+                <w:szCs w:val="16"/>
+              </w:rPr>
+            </w:pPr>
+            <w:r>
+              <w:rPr>
+                <w:b/>
+                <w:bCs/>
+                <w:color w:val="000000" w:themeColor="text1"/>
+                <w:sz w:val="16"/>
+                <w:szCs w:val="16"/>
+              </w:rPr>
+              <w:t>X</w:t>
+            </w:r>
+          </w:p>
+        </w:tc>
+        <w:tc>
+          <w:tcPr>
+            <w:tcW w:w="603" w:type="dxa"/>
+          </w:tcPr>
+          <w:p>
+            <w:pPr>
+              <w:jc w:val="center"/>
+              <w:rPr>
+                <w:b/>
+                <w:bCs/>
+                <w:color w:val="000000" w:themeColor="text1"/>
+                <w:sz w:val="16"/>
+                <w:szCs w:val="16"/>
+              </w:rPr>
+            </w:pPr>
+          </w:p>
+          <w:p>
+            <w:pPr>
+              <w:jc w:val="center"/>
+              <w:rPr>
+                <w:b/>
+                <w:bCs/>
+                <w:color w:val="000000" w:themeColor="text1"/>
+                <w:sz w:val="16"/>
+                <w:szCs w:val="16"/>
+              </w:rPr>
+            </w:pPr>
+          </w:p>
+          <w:p>
+            <w:pPr>
+              <w:rPr>
+                <w:b/>
+                <w:bCs/>
+                <w:color w:val="000000" w:themeColor="text1"/>
+                <w:sz w:val="16"/>
+                <w:szCs w:val="16"/>
+              </w:rPr>
+            </w:pPr>
+          </w:p>
+        </w:tc>
+        <w:tc>
+          <w:tcPr>
+            <w:tcW w:w="603" w:type="dxa"/>
+          </w:tcPr>
+          <w:p>
+            <w:pPr>
+              <w:jc w:val="center"/>
+              <w:rPr>
+                <w:b/>
+                <w:bCs/>
+                <w:color w:val="000000" w:themeColor="text1"/>
+                <w:sz w:val="16"/>
+                <w:szCs w:val="16"/>
+              </w:rPr>
+            </w:pPr>
+          </w:p>
+        </w:tc>
+        <w:tc>
+          <w:tcPr>
+            <w:tcW w:w="2521" w:type="dxa"/>
+          </w:tcPr>
+          <w:p>
+            <w:pPr>
+              <w:jc w:val="center"/>
+              <w:rPr>
+                <w:b/>
+                <w:bCs/>
+                <w:color w:val="000000" w:themeColor="text1"/>
+                <w:sz w:val="16"/>
+                <w:szCs w:val="16"/>
+              </w:rPr>
+            </w:pPr>
+            <w:r>
+              <w:rPr>
+                <w:b/>
+                <w:bCs/>
+                <w:color w:val="000000" w:themeColor="text1"/>
+                <w:sz w:val="16"/>
+                <w:szCs w:val="16"/>
+              </w:rPr>
+              <w:t>Principalmente siento que en esto mi conocimiento es bastante básico porque no recuerdo mucho de lo hecho en la programación de app móvil</w:t>
+            </w:r>
+            <w:r>
+              <w:rPr>
+                <w:b/>
+                <w:bCs/>
+                <w:color w:val="000000" w:themeColor="text1"/>
+                <w:sz w:val="16"/>
+                <w:szCs w:val="16"/>
+              </w:rPr>
+              <w:t xml:space="preserve"> y desde que lo vimos, nunca más recuerdo haberlo puesto en práctica</w:t>
+            </w:r>
+            <w:r>
+              <w:rPr>
+                <w:b/>
+                <w:bCs/>
+                <w:color w:val="000000" w:themeColor="text1"/>
+                <w:sz w:val="16"/>
+                <w:szCs w:val="16"/>
+              </w:rPr>
+              <w:t>.</w:t>
+            </w:r>
+            <w:r>
+              <w:rPr>
+                <w:b/>
+                <w:bCs/>
+                <w:color w:val="000000" w:themeColor="text1"/>
+                <w:sz w:val="16"/>
+                <w:szCs w:val="16"/>
+              </w:rPr>
+              <w:t xml:space="preserve"> nada más.</w:t>
+            </w:r>
+          </w:p>
+        </w:tc>
+      </w:tr>
+      <w:tr>
+        <w:trPr>
+          <w:trHeight w:val="591"/>
+          <w:jc w:val="center"/>
+        </w:trPr>
+        <w:tc>
+          <w:tcPr>
+            <w:tcW w:w="4388" w:type="dxa"/>
+          </w:tcPr>
+          <w:p>
+            <w:pPr>
+              <w:jc w:val="center"/>
+              <w:rPr>
+                <w:b/>
+                <w:bCs/>
+                <w:color w:val="000000" w:themeColor="text1"/>
+                <w:sz w:val="16"/>
+                <w:szCs w:val="16"/>
+              </w:rPr>
+            </w:pPr>
+            <w:r>
+              <w:rPr>
+                <w:b/>
+                <w:bCs/>
+                <w:color w:val="000000" w:themeColor="text1"/>
+                <w:sz w:val="16"/>
+                <w:szCs w:val="16"/>
+              </w:rPr>
+              <w:t>Diseñar y generar soluciones que permitan resolver los requerimientos de información en el contexto de las organizaciones, considerando bases de datos relacionales y no relacionales.</w:t>
+            </w:r>
+          </w:p>
+        </w:tc>
+        <w:tc>
+          <w:tcPr>
+            <w:tcW w:w="602" w:type="dxa"/>
+          </w:tcPr>
+          <w:p>
+            <w:pPr>
+              <w:jc w:val="center"/>
+              <w:rPr>
+                <w:b/>
+                <w:bCs/>
+                <w:color w:val="000000" w:themeColor="text1"/>
+                <w:sz w:val="16"/>
+                <w:szCs w:val="16"/>
+              </w:rPr>
+            </w:pPr>
+          </w:p>
+        </w:tc>
+        <w:tc>
+          <w:tcPr>
+            <w:tcW w:w="603" w:type="dxa"/>
+          </w:tcPr>
+          <w:p>
+            <w:pPr>
+              <w:jc w:val="center"/>
+              <w:rPr>
+                <w:b/>
+                <w:bCs/>
+                <w:color w:val="000000" w:themeColor="text1"/>
+                <w:sz w:val="16"/>
+                <w:szCs w:val="16"/>
+              </w:rPr>
+            </w:pPr>
+          </w:p>
+          <w:p>
+            <w:pPr>
+              <w:rPr>
+                <w:b/>
+                <w:bCs/>
+                <w:color w:val="000000" w:themeColor="text1"/>
+                <w:sz w:val="16"/>
+                <w:szCs w:val="16"/>
+              </w:rPr>
+            </w:pPr>
+            <w:r>
+              <w:rPr>
+                <w:b/>
+                <w:bCs/>
+                <w:color w:val="000000" w:themeColor="text1"/>
+                <w:sz w:val="16"/>
+                <w:szCs w:val="16"/>
+              </w:rPr>
+              <w:t xml:space="preserve">    X</w:t>
+            </w:r>
+          </w:p>
+        </w:tc>
+        <w:tc>
+          <w:tcPr>
+            <w:tcW w:w="603" w:type="dxa"/>
+          </w:tcPr>
+          <w:p>
+            <w:pPr>
+              <w:jc w:val="center"/>
+              <w:rPr>
+                <w:b/>
+                <w:bCs/>
+                <w:color w:val="000000" w:themeColor="text1"/>
+                <w:sz w:val="16"/>
+                <w:szCs w:val="16"/>
+              </w:rPr>
+            </w:pPr>
+          </w:p>
+        </w:tc>
+        <w:tc>
+          <w:tcPr>
+            <w:tcW w:w="603" w:type="dxa"/>
+          </w:tcPr>
+          <w:p>
+            <w:pPr>
+              <w:jc w:val="center"/>
+              <w:rPr>
+                <w:b/>
+                <w:bCs/>
+                <w:color w:val="000000" w:themeColor="text1"/>
+                <w:sz w:val="16"/>
+                <w:szCs w:val="16"/>
+              </w:rPr>
+            </w:pPr>
+          </w:p>
+        </w:tc>
+        <w:tc>
+          <w:tcPr>
+            <w:tcW w:w="603" w:type="dxa"/>
+          </w:tcPr>
+          <w:p>
+            <w:pPr>
+              <w:jc w:val="center"/>
+              <w:rPr>
+                <w:b/>
+                <w:bCs/>
+                <w:color w:val="000000" w:themeColor="text1"/>
+                <w:sz w:val="16"/>
+                <w:szCs w:val="16"/>
+              </w:rPr>
+            </w:pPr>
+          </w:p>
+        </w:tc>
+        <w:tc>
+          <w:tcPr>
+            <w:tcW w:w="2521" w:type="dxa"/>
+          </w:tcPr>
+          <w:p>
+            <w:pPr>
+              <w:jc w:val="center"/>
+              <w:rPr>
+                <w:b/>
+                <w:bCs/>
+                <w:color w:val="000000" w:themeColor="text1"/>
+                <w:sz w:val="16"/>
+                <w:szCs w:val="16"/>
+              </w:rPr>
+            </w:pPr>
+            <w:r>
+              <w:rPr>
+                <w:b/>
+                <w:bCs/>
+                <w:color w:val="000000" w:themeColor="text1"/>
+                <w:sz w:val="16"/>
+                <w:szCs w:val="16"/>
+              </w:rPr>
+              <w:t>Me cuestan las BDD pero algo se hace sin problemas.</w:t>
+            </w:r>
+          </w:p>
+        </w:tc>
+      </w:tr>
+      <w:tr>
+        <w:trPr>
+          <w:trHeight w:val="576"/>
+          <w:jc w:val="center"/>
+        </w:trPr>
+        <w:tc>
+          <w:tcPr>
+            <w:tcW w:w="4388" w:type="dxa"/>
+          </w:tcPr>
+          <w:p>
+            <w:pPr>
+              <w:jc w:val="center"/>
+              <w:rPr>
+                <w:b/>
+                <w:bCs/>
+                <w:color w:val="000000" w:themeColor="text1"/>
+                <w:sz w:val="16"/>
+                <w:szCs w:val="16"/>
+              </w:rPr>
+            </w:pPr>
+            <w:r>
+              <w:rPr>
+                <w:b/>
+                <w:bCs/>
+                <w:color w:val="000000" w:themeColor="text1"/>
+                <w:sz w:val="16"/>
+                <w:szCs w:val="16"/>
+              </w:rPr>
               <w:t>Diseñar y adaptar los procesos de ingeniería de requisitos, a través del uso de metodologías de vanguardia y estándares de la industria, para el desarrollo de soluciones TI complejas, innovadoras y de calidad.</w:t>
             </w:r>
           </w:p>
@@ -2711,6 +2751,16 @@
                 <w:szCs w:val="16"/>
               </w:rPr>
             </w:pPr>
+            <w:r>
+              <w:rPr>
+                <w:b/>
+                <w:bCs/>
+                <w:color w:val="000000" w:themeColor="text1"/>
+                <w:sz w:val="16"/>
+                <w:szCs w:val="16"/>
+              </w:rPr>
+              <w:t>Lo mismo de antes, mientras haya un camino a seguir se hace sin problemas, el problemas es cuando yo tengo que inventármelo porque ahí me cuesta un poco mas.</w:t>
+            </w:r>
           </w:p>
         </w:tc>
       </w:tr>
@@ -2753,7 +2803,7 @@
 </file>
 
 <file path=word/endnotes.xml><?xml version="1.0" encoding="utf-8"?>
-<w:endnotes xmlns:wpc="http://schemas.microsoft.com/office/word/2010/wordprocessingCanvas" xmlns:cx="http://schemas.microsoft.com/office/drawing/2014/chartex" xmlns:cx1="http://schemas.microsoft.com/office/drawing/2015/9/8/chartex" xmlns:cx2="http://schemas.microsoft.com/office/drawing/2015/10/21/chartex" xmlns:cx3="http://schemas.microsoft.com/office/drawing/2016/5/9/chartex" xmlns:cx4="http://schemas.microsoft.com/office/drawing/2016/5/10/chartex" xmlns:cx5="http://schemas.microsoft.com/office/drawing/2016/5/11/chartex" xmlns:cx6="http://schemas.microsoft.com/office/drawing/2016/5/12/chartex" xmlns:cx7="http://schemas.microsoft.com/office/drawing/2016/5/13/chartex" xmlns:cx8="http://schemas.microsoft.com/office/drawing/2016/5/14/chartex" xmlns:mc="http://schemas.openxmlformats.org/markup-compatibility/2006" xmlns:aink="http://schemas.microsoft.com/office/drawing/2016/ink" xmlns:am3d="http://schemas.microsoft.com/office/drawing/2017/model3d" xmlns:o="urn:schemas-microsoft-com:office:office" xmlns:r="http://schemas.openxmlformats.org/officeDocument/2006/relationships" xmlns:m="http://schemas.openxmlformats.org/officeDocument/2006/math" xmlns:v="urn:schemas-microsoft-com:vml" xmlns:wp14="http://schemas.microsoft.com/office/word/2010/wordprocessingDrawing" xmlns:wp="http://schemas.openxmlformats.org/drawingml/2006/wordprocessingDrawing" xmlns:w10="urn:schemas-microsoft-com:office:word" xmlns:w="http://schemas.openxmlformats.org/wordprocessingml/2006/main" xmlns:w14="http://schemas.microsoft.com/office/word/2010/wordml" xmlns:w15="http://schemas.microsoft.com/office/word/2012/wordml" xmlns:w16cex="http://schemas.microsoft.com/office/word/2018/wordml/cex" xmlns:w16cid="http://schemas.microsoft.com/office/word/2016/wordml/cid" xmlns:w16="http://schemas.microsoft.com/office/word/2018/wordml" xmlns:w16sdtdh="http://schemas.microsoft.com/office/word/2020/wordml/sdtdatahash" xmlns:w16se="http://schemas.microsoft.com/office/word/2015/wordml/symex" xmlns:wpg="http://schemas.microsoft.com/office/word/2010/wordprocessingGroup" xmlns:wpi="http://schemas.microsoft.com/office/word/2010/wordprocessingInk" xmlns:wne="http://schemas.microsoft.com/office/word/2006/wordml" xmlns:wps="http://schemas.microsoft.com/office/word/2010/wordprocessingShape" mc:Ignorable="w14 w15 w16se w16cid w16 w16cex w16sdtdh wp14">
+<w:endnotes xmlns:wpc="http://schemas.microsoft.com/office/word/2010/wordprocessingCanvas" xmlns:cx="http://schemas.microsoft.com/office/drawing/2014/chartex" xmlns:cx1="http://schemas.microsoft.com/office/drawing/2015/9/8/chartex" xmlns:cx2="http://schemas.microsoft.com/office/drawing/2015/10/21/chartex" xmlns:cx3="http://schemas.microsoft.com/office/drawing/2016/5/9/chartex" xmlns:cx4="http://schemas.microsoft.com/office/drawing/2016/5/10/chartex" xmlns:cx5="http://schemas.microsoft.com/office/drawing/2016/5/11/chartex" xmlns:cx6="http://schemas.microsoft.com/office/drawing/2016/5/12/chartex" xmlns:cx7="http://schemas.microsoft.com/office/drawing/2016/5/13/chartex" xmlns:cx8="http://schemas.microsoft.com/office/drawing/2016/5/14/chartex" xmlns:mc="http://schemas.openxmlformats.org/markup-compatibility/2006" xmlns:aink="http://schemas.microsoft.com/office/drawing/2016/ink" xmlns:am3d="http://schemas.microsoft.com/office/drawing/2017/model3d" xmlns:o="urn:schemas-microsoft-com:office:office" xmlns:oel="http://schemas.microsoft.com/office/2019/extlst" xmlns:r="http://schemas.openxmlformats.org/officeDocument/2006/relationships" xmlns:m="http://schemas.openxmlformats.org/officeDocument/2006/math" xmlns:v="urn:schemas-microsoft-com:vml" xmlns:wp14="http://schemas.microsoft.com/office/word/2010/wordprocessingDrawing" xmlns:wp="http://schemas.openxmlformats.org/drawingml/2006/wordprocessingDrawing" xmlns:w10="urn:schemas-microsoft-com:office:word" xmlns:w="http://schemas.openxmlformats.org/wordprocessingml/2006/main" xmlns:w14="http://schemas.microsoft.com/office/word/2010/wordml" xmlns:w15="http://schemas.microsoft.com/office/word/2012/wordml" xmlns:w16cex="http://schemas.microsoft.com/office/word/2018/wordml/cex" xmlns:w16cid="http://schemas.microsoft.com/office/word/2016/wordml/cid" xmlns:w16="http://schemas.microsoft.com/office/word/2018/wordml" xmlns:w16du="http://schemas.microsoft.com/office/word/2023/wordml/word16du" xmlns:w16sdtdh="http://schemas.microsoft.com/office/word/2020/wordml/sdtdatahash" xmlns:w16sdtfl="http://schemas.microsoft.com/office/word/2024/wordml/sdtformatlock" xmlns:w16se="http://schemas.microsoft.com/office/word/2015/wordml/symex" xmlns:wpg="http://schemas.microsoft.com/office/word/2010/wordprocessingGroup" xmlns:wpi="http://schemas.microsoft.com/office/word/2010/wordprocessingInk" xmlns:wne="http://schemas.microsoft.com/office/word/2006/wordml" xmlns:wps="http://schemas.microsoft.com/office/word/2010/wordprocessingShape" mc:Ignorable="w14 w15 w16se w16cid w16 w16cex w16sdtdh w16sdtfl w16du wp14">
   <w:endnote w:type="separator" w:id="-1">
     <w:p>
       <w:pPr>
@@ -2778,7 +2828,7 @@
 </file>
 
 <file path=word/footer1.xml><?xml version="1.0" encoding="utf-8"?>
-<w:ftr xmlns:wpc="http://schemas.microsoft.com/office/word/2010/wordprocessingCanvas" xmlns:cx="http://schemas.microsoft.com/office/drawing/2014/chartex" xmlns:cx1="http://schemas.microsoft.com/office/drawing/2015/9/8/chartex" xmlns:cx2="http://schemas.microsoft.com/office/drawing/2015/10/21/chartex" xmlns:cx3="http://schemas.microsoft.com/office/drawing/2016/5/9/chartex" xmlns:cx4="http://schemas.microsoft.com/office/drawing/2016/5/10/chartex" xmlns:cx5="http://schemas.microsoft.com/office/drawing/2016/5/11/chartex" xmlns:cx6="http://schemas.microsoft.com/office/drawing/2016/5/12/chartex" xmlns:cx7="http://schemas.microsoft.com/office/drawing/2016/5/13/chartex" xmlns:cx8="http://schemas.microsoft.com/office/drawing/2016/5/14/chartex" xmlns:mc="http://schemas.openxmlformats.org/markup-compatibility/2006" xmlns:aink="http://schemas.microsoft.com/office/drawing/2016/ink" xmlns:am3d="http://schemas.microsoft.com/office/drawing/2017/model3d" xmlns:o="urn:schemas-microsoft-com:office:office" xmlns:r="http://schemas.openxmlformats.org/officeDocument/2006/relationships" xmlns:m="http://schemas.openxmlformats.org/officeDocument/2006/math" xmlns:v="urn:schemas-microsoft-com:vml" xmlns:wp14="http://schemas.microsoft.com/office/word/2010/wordprocessingDrawing" xmlns:wp="http://schemas.openxmlformats.org/drawingml/2006/wordprocessingDrawing" xmlns:w10="urn:schemas-microsoft-com:office:word" xmlns:w="http://schemas.openxmlformats.org/wordprocessingml/2006/main" xmlns:w14="http://schemas.microsoft.com/office/word/2010/wordml" xmlns:w15="http://schemas.microsoft.com/office/word/2012/wordml" xmlns:w16cex="http://schemas.microsoft.com/office/word/2018/wordml/cex" xmlns:w16cid="http://schemas.microsoft.com/office/word/2016/wordml/cid" xmlns:w16="http://schemas.microsoft.com/office/word/2018/wordml" xmlns:w16sdtdh="http://schemas.microsoft.com/office/word/2020/wordml/sdtdatahash" xmlns:w16se="http://schemas.microsoft.com/office/word/2015/wordml/symex" xmlns:wpg="http://schemas.microsoft.com/office/word/2010/wordprocessingGroup" xmlns:wpi="http://schemas.microsoft.com/office/word/2010/wordprocessingInk" xmlns:wne="http://schemas.microsoft.com/office/word/2006/wordml" xmlns:wps="http://schemas.microsoft.com/office/word/2010/wordprocessingShape" mc:Ignorable="w14 w15 w16se w16cid w16 w16cex w16sdtdh wp14">
+<w:ftr xmlns:wpc="http://schemas.microsoft.com/office/word/2010/wordprocessingCanvas" xmlns:cx="http://schemas.microsoft.com/office/drawing/2014/chartex" xmlns:cx1="http://schemas.microsoft.com/office/drawing/2015/9/8/chartex" xmlns:cx2="http://schemas.microsoft.com/office/drawing/2015/10/21/chartex" xmlns:cx3="http://schemas.microsoft.com/office/drawing/2016/5/9/chartex" xmlns:cx4="http://schemas.microsoft.com/office/drawing/2016/5/10/chartex" xmlns:cx5="http://schemas.microsoft.com/office/drawing/2016/5/11/chartex" xmlns:cx6="http://schemas.microsoft.com/office/drawing/2016/5/12/chartex" xmlns:cx7="http://schemas.microsoft.com/office/drawing/2016/5/13/chartex" xmlns:cx8="http://schemas.microsoft.com/office/drawing/2016/5/14/chartex" xmlns:mc="http://schemas.openxmlformats.org/markup-compatibility/2006" xmlns:aink="http://schemas.microsoft.com/office/drawing/2016/ink" xmlns:am3d="http://schemas.microsoft.com/office/drawing/2017/model3d" xmlns:o="urn:schemas-microsoft-com:office:office" xmlns:oel="http://schemas.microsoft.com/office/2019/extlst" xmlns:r="http://schemas.openxmlformats.org/officeDocument/2006/relationships" xmlns:m="http://schemas.openxmlformats.org/officeDocument/2006/math" xmlns:v="urn:schemas-microsoft-com:vml" xmlns:wp14="http://schemas.microsoft.com/office/word/2010/wordprocessingDrawing" xmlns:wp="http://schemas.openxmlformats.org/drawingml/2006/wordprocessingDrawing" xmlns:w10="urn:schemas-microsoft-com:office:word" xmlns:w="http://schemas.openxmlformats.org/wordprocessingml/2006/main" xmlns:w14="http://schemas.microsoft.com/office/word/2010/wordml" xmlns:w15="http://schemas.microsoft.com/office/word/2012/wordml" xmlns:w16cex="http://schemas.microsoft.com/office/word/2018/wordml/cex" xmlns:w16cid="http://schemas.microsoft.com/office/word/2016/wordml/cid" xmlns:w16="http://schemas.microsoft.com/office/word/2018/wordml" xmlns:w16du="http://schemas.microsoft.com/office/word/2023/wordml/word16du" xmlns:w16sdtdh="http://schemas.microsoft.com/office/word/2020/wordml/sdtdatahash" xmlns:w16sdtfl="http://schemas.microsoft.com/office/word/2024/wordml/sdtformatlock" xmlns:w16se="http://schemas.microsoft.com/office/word/2015/wordml/symex" xmlns:wpg="http://schemas.microsoft.com/office/word/2010/wordprocessingGroup" xmlns:wpi="http://schemas.microsoft.com/office/word/2010/wordprocessingInk" xmlns:wne="http://schemas.microsoft.com/office/word/2006/wordml" xmlns:wps="http://schemas.microsoft.com/office/word/2010/wordprocessingShape" mc:Ignorable="w14 w15 w16se w16cid w16 w16cex w16sdtdh w16sdtfl w16du wp14">
   <w:p>
     <w:pPr>
       <w:pStyle w:val="Piedepgina"/>
@@ -2788,7 +2838,7 @@
 </file>
 
 <file path=word/footer2.xml><?xml version="1.0" encoding="utf-8"?>
-<w:ftr xmlns:wpc="http://schemas.microsoft.com/office/word/2010/wordprocessingCanvas" xmlns:cx="http://schemas.microsoft.com/office/drawing/2014/chartex" xmlns:cx1="http://schemas.microsoft.com/office/drawing/2015/9/8/chartex" xmlns:cx2="http://schemas.microsoft.com/office/drawing/2015/10/21/chartex" xmlns:cx3="http://schemas.microsoft.com/office/drawing/2016/5/9/chartex" xmlns:cx4="http://schemas.microsoft.com/office/drawing/2016/5/10/chartex" xmlns:cx5="http://schemas.microsoft.com/office/drawing/2016/5/11/chartex" xmlns:cx6="http://schemas.microsoft.com/office/drawing/2016/5/12/chartex" xmlns:cx7="http://schemas.microsoft.com/office/drawing/2016/5/13/chartex" xmlns:cx8="http://schemas.microsoft.com/office/drawing/2016/5/14/chartex" xmlns:mc="http://schemas.openxmlformats.org/markup-compatibility/2006" xmlns:aink="http://schemas.microsoft.com/office/drawing/2016/ink" xmlns:am3d="http://schemas.microsoft.com/office/drawing/2017/model3d" xmlns:o="urn:schemas-microsoft-com:office:office" xmlns:r="http://schemas.openxmlformats.org/officeDocument/2006/relationships" xmlns:m="http://schemas.openxmlformats.org/officeDocument/2006/math" xmlns:v="urn:schemas-microsoft-com:vml" xmlns:wp14="http://schemas.microsoft.com/office/word/2010/wordprocessingDrawing" xmlns:wp="http://schemas.openxmlformats.org/drawingml/2006/wordprocessingDrawing" xmlns:w10="urn:schemas-microsoft-com:office:word" xmlns:w="http://schemas.openxmlformats.org/wordprocessingml/2006/main" xmlns:w14="http://schemas.microsoft.com/office/word/2010/wordml" xmlns:w15="http://schemas.microsoft.com/office/word/2012/wordml" xmlns:w16cex="http://schemas.microsoft.com/office/word/2018/wordml/cex" xmlns:w16cid="http://schemas.microsoft.com/office/word/2016/wordml/cid" xmlns:w16="http://schemas.microsoft.com/office/word/2018/wordml" xmlns:w16sdtdh="http://schemas.microsoft.com/office/word/2020/wordml/sdtdatahash" xmlns:w16se="http://schemas.microsoft.com/office/word/2015/wordml/symex" xmlns:wpg="http://schemas.microsoft.com/office/word/2010/wordprocessingGroup" xmlns:wpi="http://schemas.microsoft.com/office/word/2010/wordprocessingInk" xmlns:wne="http://schemas.microsoft.com/office/word/2006/wordml" xmlns:wps="http://schemas.microsoft.com/office/word/2010/wordprocessingShape" mc:Ignorable="w14 w15 w16se w16cid w16 w16cex w16sdtdh wp14">
+<w:ftr xmlns:wpc="http://schemas.microsoft.com/office/word/2010/wordprocessingCanvas" xmlns:cx="http://schemas.microsoft.com/office/drawing/2014/chartex" xmlns:cx1="http://schemas.microsoft.com/office/drawing/2015/9/8/chartex" xmlns:cx2="http://schemas.microsoft.com/office/drawing/2015/10/21/chartex" xmlns:cx3="http://schemas.microsoft.com/office/drawing/2016/5/9/chartex" xmlns:cx4="http://schemas.microsoft.com/office/drawing/2016/5/10/chartex" xmlns:cx5="http://schemas.microsoft.com/office/drawing/2016/5/11/chartex" xmlns:cx6="http://schemas.microsoft.com/office/drawing/2016/5/12/chartex" xmlns:cx7="http://schemas.microsoft.com/office/drawing/2016/5/13/chartex" xmlns:cx8="http://schemas.microsoft.com/office/drawing/2016/5/14/chartex" xmlns:mc="http://schemas.openxmlformats.org/markup-compatibility/2006" xmlns:aink="http://schemas.microsoft.com/office/drawing/2016/ink" xmlns:am3d="http://schemas.microsoft.com/office/drawing/2017/model3d" xmlns:o="urn:schemas-microsoft-com:office:office" xmlns:oel="http://schemas.microsoft.com/office/2019/extlst" xmlns:r="http://schemas.openxmlformats.org/officeDocument/2006/relationships" xmlns:m="http://schemas.openxmlformats.org/officeDocument/2006/math" xmlns:v="urn:schemas-microsoft-com:vml" xmlns:wp14="http://schemas.microsoft.com/office/word/2010/wordprocessingDrawing" xmlns:wp="http://schemas.openxmlformats.org/drawingml/2006/wordprocessingDrawing" xmlns:w10="urn:schemas-microsoft-com:office:word" xmlns:w="http://schemas.openxmlformats.org/wordprocessingml/2006/main" xmlns:w14="http://schemas.microsoft.com/office/word/2010/wordml" xmlns:w15="http://schemas.microsoft.com/office/word/2012/wordml" xmlns:w16cex="http://schemas.microsoft.com/office/word/2018/wordml/cex" xmlns:w16cid="http://schemas.microsoft.com/office/word/2016/wordml/cid" xmlns:w16="http://schemas.microsoft.com/office/word/2018/wordml" xmlns:w16du="http://schemas.microsoft.com/office/word/2023/wordml/word16du" xmlns:w16sdtdh="http://schemas.microsoft.com/office/word/2020/wordml/sdtdatahash" xmlns:w16sdtfl="http://schemas.microsoft.com/office/word/2024/wordml/sdtformatlock" xmlns:w16se="http://schemas.microsoft.com/office/word/2015/wordml/symex" xmlns:wpg="http://schemas.microsoft.com/office/word/2010/wordprocessingGroup" xmlns:wpi="http://schemas.microsoft.com/office/word/2010/wordprocessingInk" xmlns:wne="http://schemas.microsoft.com/office/word/2006/wordml" xmlns:wps="http://schemas.microsoft.com/office/word/2010/wordprocessingShape" mc:Ignorable="w14 w15 w16se w16cid w16 w16cex w16sdtdh w16sdtfl w16du wp14">
   <w:sdt>
     <w:sdtPr>
       <w:id w:val="-1904276369"/>
@@ -2797,7 +2847,6 @@
         <w:docPartUnique/>
       </w:docPartObj>
     </w:sdtPr>
-    <w:sdtEndPr/>
     <w:sdtContent>
       <w:p>
         <w:pPr>
@@ -3007,7 +3056,7 @@
                 </wp:anchor>
               </w:drawing>
             </mc:Choice>
-            <mc:Fallback xmlns:w16sdtfl="http://schemas.microsoft.com/office/word/2024/wordml/sdtformatlock" xmlns:w16du="http://schemas.microsoft.com/office/word/2023/wordml/word16du" xmlns:w16cei="http://schemas.microsoft.com/office/word/2026/wordml/cei" xmlns:oel="http://schemas.microsoft.com/office/2019/extlst">
+            <mc:Fallback xmlns:w16cei="http://schemas.microsoft.com/office/word/2026/wordml/cei">
               <w:pict>
                 <v:group w14:anchorId="51D00065" id="Grupo 32" o:spid="_x0000_s1026" style="position:absolute;margin-left:0;margin-top:0;width:610.5pt;height:15pt;z-index:251659264;mso-width-percent:1000;mso-position-horizontal:center;mso-position-horizontal-relative:page;mso-position-vertical:center;mso-position-vertical-relative:bottom-margin-area;mso-width-percent:1000" coordorigin=",14970" coordsize="12255,300" o:gfxdata="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">
                   <v:shapetype id="_x0000_t202" coordsize="21600,21600" o:spt="202" path="m,l,21600r21600,l21600,xe">
@@ -3076,7 +3125,7 @@
 </file>
 
 <file path=word/footer3.xml><?xml version="1.0" encoding="utf-8"?>
-<w:ftr xmlns:wpc="http://schemas.microsoft.com/office/word/2010/wordprocessingCanvas" xmlns:cx="http://schemas.microsoft.com/office/drawing/2014/chartex" xmlns:cx1="http://schemas.microsoft.com/office/drawing/2015/9/8/chartex" xmlns:cx2="http://schemas.microsoft.com/office/drawing/2015/10/21/chartex" xmlns:cx3="http://schemas.microsoft.com/office/drawing/2016/5/9/chartex" xmlns:cx4="http://schemas.microsoft.com/office/drawing/2016/5/10/chartex" xmlns:cx5="http://schemas.microsoft.com/office/drawing/2016/5/11/chartex" xmlns:cx6="http://schemas.microsoft.com/office/drawing/2016/5/12/chartex" xmlns:cx7="http://schemas.microsoft.com/office/drawing/2016/5/13/chartex" xmlns:cx8="http://schemas.microsoft.com/office/drawing/2016/5/14/chartex" xmlns:mc="http://schemas.openxmlformats.org/markup-compatibility/2006" xmlns:aink="http://schemas.microsoft.com/office/drawing/2016/ink" xmlns:am3d="http://schemas.microsoft.com/office/drawing/2017/model3d" xmlns:o="urn:schemas-microsoft-com:office:office" xmlns:r="http://schemas.openxmlformats.org/officeDocument/2006/relationships" xmlns:m="http://schemas.openxmlformats.org/officeDocument/2006/math" xmlns:v="urn:schemas-microsoft-com:vml" xmlns:wp14="http://schemas.microsoft.com/office/word/2010/wordprocessingDrawing" xmlns:wp="http://schemas.openxmlformats.org/drawingml/2006/wordprocessingDrawing" xmlns:w10="urn:schemas-microsoft-com:office:word" xmlns:w="http://schemas.openxmlformats.org/wordprocessingml/2006/main" xmlns:w14="http://schemas.microsoft.com/office/word/2010/wordml" xmlns:w15="http://schemas.microsoft.com/office/word/2012/wordml" xmlns:w16cex="http://schemas.microsoft.com/office/word/2018/wordml/cex" xmlns:w16cid="http://schemas.microsoft.com/office/word/2016/wordml/cid" xmlns:w16="http://schemas.microsoft.com/office/word/2018/wordml" xmlns:w16sdtdh="http://schemas.microsoft.com/office/word/2020/wordml/sdtdatahash" xmlns:w16se="http://schemas.microsoft.com/office/word/2015/wordml/symex" xmlns:wpg="http://schemas.microsoft.com/office/word/2010/wordprocessingGroup" xmlns:wpi="http://schemas.microsoft.com/office/word/2010/wordprocessingInk" xmlns:wne="http://schemas.microsoft.com/office/word/2006/wordml" xmlns:wps="http://schemas.microsoft.com/office/word/2010/wordprocessingShape" mc:Ignorable="w14 w15 w16se w16cid w16 w16cex w16sdtdh wp14">
+<w:ftr xmlns:wpc="http://schemas.microsoft.com/office/word/2010/wordprocessingCanvas" xmlns:cx="http://schemas.microsoft.com/office/drawing/2014/chartex" xmlns:cx1="http://schemas.microsoft.com/office/drawing/2015/9/8/chartex" xmlns:cx2="http://schemas.microsoft.com/office/drawing/2015/10/21/chartex" xmlns:cx3="http://schemas.microsoft.com/office/drawing/2016/5/9/chartex" xmlns:cx4="http://schemas.microsoft.com/office/drawing/2016/5/10/chartex" xmlns:cx5="http://schemas.microsoft.com/office/drawing/2016/5/11/chartex" xmlns:cx6="http://schemas.microsoft.com/office/drawing/2016/5/12/chartex" xmlns:cx7="http://schemas.microsoft.com/office/drawing/2016/5/13/chartex" xmlns:cx8="http://schemas.microsoft.com/office/drawing/2016/5/14/chartex" xmlns:mc="http://schemas.openxmlformats.org/markup-compatibility/2006" xmlns:aink="http://schemas.microsoft.com/office/drawing/2016/ink" xmlns:am3d="http://schemas.microsoft.com/office/drawing/2017/model3d" xmlns:o="urn:schemas-microsoft-com:office:office" xmlns:oel="http://schemas.microsoft.com/office/2019/extlst" xmlns:r="http://schemas.openxmlformats.org/officeDocument/2006/relationships" xmlns:m="http://schemas.openxmlformats.org/officeDocument/2006/math" xmlns:v="urn:schemas-microsoft-com:vml" xmlns:wp14="http://schemas.microsoft.com/office/word/2010/wordprocessingDrawing" xmlns:wp="http://schemas.openxmlformats.org/drawingml/2006/wordprocessingDrawing" xmlns:w10="urn:schemas-microsoft-com:office:word" xmlns:w="http://schemas.openxmlformats.org/wordprocessingml/2006/main" xmlns:w14="http://schemas.microsoft.com/office/word/2010/wordml" xmlns:w15="http://schemas.microsoft.com/office/word/2012/wordml" xmlns:w16cex="http://schemas.microsoft.com/office/word/2018/wordml/cex" xmlns:w16cid="http://schemas.microsoft.com/office/word/2016/wordml/cid" xmlns:w16="http://schemas.microsoft.com/office/word/2018/wordml" xmlns:w16du="http://schemas.microsoft.com/office/word/2023/wordml/word16du" xmlns:w16sdtdh="http://schemas.microsoft.com/office/word/2020/wordml/sdtdatahash" xmlns:w16sdtfl="http://schemas.microsoft.com/office/word/2024/wordml/sdtformatlock" xmlns:w16se="http://schemas.microsoft.com/office/word/2015/wordml/symex" xmlns:wpg="http://schemas.microsoft.com/office/word/2010/wordprocessingGroup" xmlns:wpi="http://schemas.microsoft.com/office/word/2010/wordprocessingInk" xmlns:wne="http://schemas.microsoft.com/office/word/2006/wordml" xmlns:wps="http://schemas.microsoft.com/office/word/2010/wordprocessingShape" mc:Ignorable="w14 w15 w16se w16cid w16 w16cex w16sdtdh w16sdtfl w16du wp14">
   <w:p>
     <w:pPr>
       <w:pStyle w:val="Piedepgina"/>
@@ -3086,7 +3135,7 @@
 </file>
 
 <file path=word/footnotes.xml><?xml version="1.0" encoding="utf-8"?>
-<w:footnotes xmlns:wpc="http://schemas.microsoft.com/office/word/2010/wordprocessingCanvas" xmlns:cx="http://schemas.microsoft.com/office/drawing/2014/chartex" xmlns:cx1="http://schemas.microsoft.com/office/drawing/2015/9/8/chartex" xmlns:cx2="http://schemas.microsoft.com/office/drawing/2015/10/21/chartex" xmlns:cx3="http://schemas.microsoft.com/office/drawing/2016/5/9/chartex" xmlns:cx4="http://schemas.microsoft.com/office/drawing/2016/5/10/chartex" xmlns:cx5="http://schemas.microsoft.com/office/drawing/2016/5/11/chartex" xmlns:cx6="http://schemas.microsoft.com/office/drawing/2016/5/12/chartex" xmlns:cx7="http://schemas.microsoft.com/office/drawing/2016/5/13/chartex" xmlns:cx8="http://schemas.microsoft.com/office/drawing/2016/5/14/chartex" xmlns:mc="http://schemas.openxmlformats.org/markup-compatibility/2006" xmlns:aink="http://schemas.microsoft.com/office/drawing/2016/ink" xmlns:am3d="http://schemas.microsoft.com/office/drawing/2017/model3d" xmlns:o="urn:schemas-microsoft-com:office:office" xmlns:r="http://schemas.openxmlformats.org/officeDocument/2006/relationships" xmlns:m="http://schemas.openxmlformats.org/officeDocument/2006/math" xmlns:v="urn:schemas-microsoft-com:vml" xmlns:wp14="http://schemas.microsoft.com/office/word/2010/wordprocessingDrawing" xmlns:wp="http://schemas.openxmlformats.org/drawingml/2006/wordprocessingDrawing" xmlns:w10="urn:schemas-microsoft-com:office:word" xmlns:w="http://schemas.openxmlformats.org/wordprocessingml/2006/main" xmlns:w14="http://schemas.microsoft.com/office/word/2010/wordml" xmlns:w15="http://schemas.microsoft.com/office/word/2012/wordml" xmlns:w16cex="http://schemas.microsoft.com/office/word/2018/wordml/cex" xmlns:w16cid="http://schemas.microsoft.com/office/word/2016/wordml/cid" xmlns:w16="http://schemas.microsoft.com/office/word/2018/wordml" xmlns:w16sdtdh="http://schemas.microsoft.com/office/word/2020/wordml/sdtdatahash" xmlns:w16se="http://schemas.microsoft.com/office/word/2015/wordml/symex" xmlns:wpg="http://schemas.microsoft.com/office/word/2010/wordprocessingGroup" xmlns:wpi="http://schemas.microsoft.com/office/word/2010/wordprocessingInk" xmlns:wne="http://schemas.microsoft.com/office/word/2006/wordml" xmlns:wps="http://schemas.microsoft.com/office/word/2010/wordprocessingShape" mc:Ignorable="w14 w15 w16se w16cid w16 w16cex w16sdtdh wp14">
+<w:footnotes xmlns:wpc="http://schemas.microsoft.com/office/word/2010/wordprocessingCanvas" xmlns:cx="http://schemas.microsoft.com/office/drawing/2014/chartex" xmlns:cx1="http://schemas.microsoft.com/office/drawing/2015/9/8/chartex" xmlns:cx2="http://schemas.microsoft.com/office/drawing/2015/10/21/chartex" xmlns:cx3="http://schemas.microsoft.com/office/drawing/2016/5/9/chartex" xmlns:cx4="http://schemas.microsoft.com/office/drawing/2016/5/10/chartex" xmlns:cx5="http://schemas.microsoft.com/office/drawing/2016/5/11/chartex" xmlns:cx6="http://schemas.microsoft.com/office/drawing/2016/5/12/chartex" xmlns:cx7="http://schemas.microsoft.com/office/drawing/2016/5/13/chartex" xmlns:cx8="http://schemas.microsoft.com/office/drawing/2016/5/14/chartex" xmlns:mc="http://schemas.openxmlformats.org/markup-compatibility/2006" xmlns:aink="http://schemas.microsoft.com/office/drawing/2016/ink" xmlns:am3d="http://schemas.microsoft.com/office/drawing/2017/model3d" xmlns:o="urn:schemas-microsoft-com:office:office" xmlns:oel="http://schemas.microsoft.com/office/2019/extlst" xmlns:r="http://schemas.openxmlformats.org/officeDocument/2006/relationships" xmlns:m="http://schemas.openxmlformats.org/officeDocument/2006/math" xmlns:v="urn:schemas-microsoft-com:vml" xmlns:wp14="http://schemas.microsoft.com/office/word/2010/wordprocessingDrawing" xmlns:wp="http://schemas.openxmlformats.org/drawingml/2006/wordprocessingDrawing" xmlns:w10="urn:schemas-microsoft-com:office:word" xmlns:w="http://schemas.openxmlformats.org/wordprocessingml/2006/main" xmlns:w14="http://schemas.microsoft.com/office/word/2010/wordml" xmlns:w15="http://schemas.microsoft.com/office/word/2012/wordml" xmlns:w16cex="http://schemas.microsoft.com/office/word/2018/wordml/cex" xmlns:w16cid="http://schemas.microsoft.com/office/word/2016/wordml/cid" xmlns:w16="http://schemas.microsoft.com/office/word/2018/wordml" xmlns:w16du="http://schemas.microsoft.com/office/word/2023/wordml/word16du" xmlns:w16sdtdh="http://schemas.microsoft.com/office/word/2020/wordml/sdtdatahash" xmlns:w16sdtfl="http://schemas.microsoft.com/office/word/2024/wordml/sdtformatlock" xmlns:w16se="http://schemas.microsoft.com/office/word/2015/wordml/symex" xmlns:wpg="http://schemas.microsoft.com/office/word/2010/wordprocessingGroup" xmlns:wpi="http://schemas.microsoft.com/office/word/2010/wordprocessingInk" xmlns:wne="http://schemas.microsoft.com/office/word/2006/wordml" xmlns:wps="http://schemas.microsoft.com/office/word/2010/wordprocessingShape" mc:Ignorable="w14 w15 w16se w16cid w16 w16cex w16sdtdh w16sdtfl w16du wp14">
   <w:footnote w:type="separator" w:id="-1">
     <w:p>
       <w:pPr>
@@ -3111,7 +3160,7 @@
 </file>
 
 <file path=word/header1.xml><?xml version="1.0" encoding="utf-8"?>
-<w:hdr xmlns:wpc="http://schemas.microsoft.com/office/word/2010/wordprocessingCanvas" xmlns:cx="http://schemas.microsoft.com/office/drawing/2014/chartex" xmlns:cx1="http://schemas.microsoft.com/office/drawing/2015/9/8/chartex" xmlns:cx2="http://schemas.microsoft.com/office/drawing/2015/10/21/chartex" xmlns:cx3="http://schemas.microsoft.com/office/drawing/2016/5/9/chartex" xmlns:cx4="http://schemas.microsoft.com/office/drawing/2016/5/10/chartex" xmlns:cx5="http://schemas.microsoft.com/office/drawing/2016/5/11/chartex" xmlns:cx6="http://schemas.microsoft.com/office/drawing/2016/5/12/chartex" xmlns:cx7="http://schemas.microsoft.com/office/drawing/2016/5/13/chartex" xmlns:cx8="http://schemas.microsoft.com/office/drawing/2016/5/14/chartex" xmlns:mc="http://schemas.openxmlformats.org/markup-compatibility/2006" xmlns:aink="http://schemas.microsoft.com/office/drawing/2016/ink" xmlns:am3d="http://schemas.microsoft.com/office/drawing/2017/model3d" xmlns:o="urn:schemas-microsoft-com:office:office" xmlns:r="http://schemas.openxmlformats.org/officeDocument/2006/relationships" xmlns:m="http://schemas.openxmlformats.org/officeDocument/2006/math" xmlns:v="urn:schemas-microsoft-com:vml" xmlns:wp14="http://schemas.microsoft.com/office/word/2010/wordprocessingDrawing" xmlns:wp="http://schemas.openxmlformats.org/drawingml/2006/wordprocessingDrawing" xmlns:w10="urn:schemas-microsoft-com:office:word" xmlns:w="http://schemas.openxmlformats.org/wordprocessingml/2006/main" xmlns:w14="http://schemas.microsoft.com/office/word/2010/wordml" xmlns:w15="http://schemas.microsoft.com/office/word/2012/wordml" xmlns:w16cex="http://schemas.microsoft.com/office/word/2018/wordml/cex" xmlns:w16cid="http://schemas.microsoft.com/office/word/2016/wordml/cid" xmlns:w16="http://schemas.microsoft.com/office/word/2018/wordml" xmlns:w16sdtdh="http://schemas.microsoft.com/office/word/2020/wordml/sdtdatahash" xmlns:w16se="http://schemas.microsoft.com/office/word/2015/wordml/symex" xmlns:wpg="http://schemas.microsoft.com/office/word/2010/wordprocessingGroup" xmlns:wpi="http://schemas.microsoft.com/office/word/2010/wordprocessingInk" xmlns:wne="http://schemas.microsoft.com/office/word/2006/wordml" xmlns:wps="http://schemas.microsoft.com/office/word/2010/wordprocessingShape" mc:Ignorable="w14 w15 w16se w16cid w16 w16cex w16sdtdh wp14">
+<w:hdr xmlns:wpc="http://schemas.microsoft.com/office/word/2010/wordprocessingCanvas" xmlns:cx="http://schemas.microsoft.com/office/drawing/2014/chartex" xmlns:cx1="http://schemas.microsoft.com/office/drawing/2015/9/8/chartex" xmlns:cx2="http://schemas.microsoft.com/office/drawing/2015/10/21/chartex" xmlns:cx3="http://schemas.microsoft.com/office/drawing/2016/5/9/chartex" xmlns:cx4="http://schemas.microsoft.com/office/drawing/2016/5/10/chartex" xmlns:cx5="http://schemas.microsoft.com/office/drawing/2016/5/11/chartex" xmlns:cx6="http://schemas.microsoft.com/office/drawing/2016/5/12/chartex" xmlns:cx7="http://schemas.microsoft.com/office/drawing/2016/5/13/chartex" xmlns:cx8="http://schemas.microsoft.com/office/drawing/2016/5/14/chartex" xmlns:mc="http://schemas.openxmlformats.org/markup-compatibility/2006" xmlns:aink="http://schemas.microsoft.com/office/drawing/2016/ink" xmlns:am3d="http://schemas.microsoft.com/office/drawing/2017/model3d" xmlns:o="urn:schemas-microsoft-com:office:office" xmlns:oel="http://schemas.microsoft.com/office/2019/extlst" xmlns:r="http://schemas.openxmlformats.org/officeDocument/2006/relationships" xmlns:m="http://schemas.openxmlformats.org/officeDocument/2006/math" xmlns:v="urn:schemas-microsoft-com:vml" xmlns:wp14="http://schemas.microsoft.com/office/word/2010/wordprocessingDrawing" xmlns:wp="http://schemas.openxmlformats.org/drawingml/2006/wordprocessingDrawing" xmlns:w10="urn:schemas-microsoft-com:office:word" xmlns:w="http://schemas.openxmlformats.org/wordprocessingml/2006/main" xmlns:w14="http://schemas.microsoft.com/office/word/2010/wordml" xmlns:w15="http://schemas.microsoft.com/office/word/2012/wordml" xmlns:w16cex="http://schemas.microsoft.com/office/word/2018/wordml/cex" xmlns:w16cid="http://schemas.microsoft.com/office/word/2016/wordml/cid" xmlns:w16="http://schemas.microsoft.com/office/word/2018/wordml" xmlns:w16du="http://schemas.microsoft.com/office/word/2023/wordml/word16du" xmlns:w16sdtdh="http://schemas.microsoft.com/office/word/2020/wordml/sdtdatahash" xmlns:w16sdtfl="http://schemas.microsoft.com/office/word/2024/wordml/sdtformatlock" xmlns:w16se="http://schemas.microsoft.com/office/word/2015/wordml/symex" xmlns:wpg="http://schemas.microsoft.com/office/word/2010/wordprocessingGroup" xmlns:wpi="http://schemas.microsoft.com/office/word/2010/wordprocessingInk" xmlns:wne="http://schemas.microsoft.com/office/word/2006/wordml" xmlns:wps="http://schemas.microsoft.com/office/word/2010/wordprocessingShape" mc:Ignorable="w14 w15 w16se w16cid w16 w16cex w16sdtdh w16sdtfl w16du wp14">
   <w:p>
     <w:pPr>
       <w:pStyle w:val="Encabezado"/>
@@ -3121,7 +3170,7 @@
 </file>
 
 <file path=word/header2.xml><?xml version="1.0" encoding="utf-8"?>
-<w:hdr xmlns:wpc="http://schemas.microsoft.com/office/word/2010/wordprocessingCanvas" xmlns:cx="http://schemas.microsoft.com/office/drawing/2014/chartex" xmlns:cx1="http://schemas.microsoft.com/office/drawing/2015/9/8/chartex" xmlns:cx2="http://schemas.microsoft.com/office/drawing/2015/10/21/chartex" xmlns:cx3="http://schemas.microsoft.com/office/drawing/2016/5/9/chartex" xmlns:cx4="http://schemas.microsoft.com/office/drawing/2016/5/10/chartex" xmlns:cx5="http://schemas.microsoft.com/office/drawing/2016/5/11/chartex" xmlns:cx6="http://schemas.microsoft.com/office/drawing/2016/5/12/chartex" xmlns:cx7="http://schemas.microsoft.com/office/drawing/2016/5/13/chartex" xmlns:cx8="http://schemas.microsoft.com/office/drawing/2016/5/14/chartex" xmlns:mc="http://schemas.openxmlformats.org/markup-compatibility/2006" xmlns:aink="http://schemas.microsoft.com/office/drawing/2016/ink" xmlns:am3d="http://schemas.microsoft.com/office/drawing/2017/model3d" xmlns:o="urn:schemas-microsoft-com:office:office" xmlns:r="http://schemas.openxmlformats.org/officeDocument/2006/relationships" xmlns:m="http://schemas.openxmlformats.org/officeDocument/2006/math" xmlns:v="urn:schemas-microsoft-com:vml" xmlns:wp14="http://schemas.microsoft.com/office/word/2010/wordprocessingDrawing" xmlns:wp="http://schemas.openxmlformats.org/drawingml/2006/wordprocessingDrawing" xmlns:w10="urn:schemas-microsoft-com:office:word" xmlns:w="http://schemas.openxmlformats.org/wordprocessingml/2006/main" xmlns:w14="http://schemas.microsoft.com/office/word/2010/wordml" xmlns:w15="http://schemas.microsoft.com/office/word/2012/wordml" xmlns:w16cex="http://schemas.microsoft.com/office/word/2018/wordml/cex" xmlns:w16cid="http://schemas.microsoft.com/office/word/2016/wordml/cid" xmlns:w16="http://schemas.microsoft.com/office/word/2018/wordml" xmlns:w16sdtdh="http://schemas.microsoft.com/office/word/2020/wordml/sdtdatahash" xmlns:w16se="http://schemas.microsoft.com/office/word/2015/wordml/symex" xmlns:wpg="http://schemas.microsoft.com/office/word/2010/wordprocessingGroup" xmlns:wpi="http://schemas.microsoft.com/office/word/2010/wordprocessingInk" xmlns:wne="http://schemas.microsoft.com/office/word/2006/wordml" xmlns:wps="http://schemas.microsoft.com/office/word/2010/wordprocessingShape" mc:Ignorable="w14 w15 w16se w16cid w16 w16cex w16sdtdh wp14">
+<w:hdr xmlns:wpc="http://schemas.microsoft.com/office/word/2010/wordprocessingCanvas" xmlns:cx="http://schemas.microsoft.com/office/drawing/2014/chartex" xmlns:cx1="http://schemas.microsoft.com/office/drawing/2015/9/8/chartex" xmlns:cx2="http://schemas.microsoft.com/office/drawing/2015/10/21/chartex" xmlns:cx3="http://schemas.microsoft.com/office/drawing/2016/5/9/chartex" xmlns:cx4="http://schemas.microsoft.com/office/drawing/2016/5/10/chartex" xmlns:cx5="http://schemas.microsoft.com/office/drawing/2016/5/11/chartex" xmlns:cx6="http://schemas.microsoft.com/office/drawing/2016/5/12/chartex" xmlns:cx7="http://schemas.microsoft.com/office/drawing/2016/5/13/chartex" xmlns:cx8="http://schemas.microsoft.com/office/drawing/2016/5/14/chartex" xmlns:mc="http://schemas.openxmlformats.org/markup-compatibility/2006" xmlns:aink="http://schemas.microsoft.com/office/drawing/2016/ink" xmlns:am3d="http://schemas.microsoft.com/office/drawing/2017/model3d" xmlns:o="urn:schemas-microsoft-com:office:office" xmlns:oel="http://schemas.microsoft.com/office/2019/extlst" xmlns:r="http://schemas.openxmlformats.org/officeDocument/2006/relationships" xmlns:m="http://schemas.openxmlformats.org/officeDocument/2006/math" xmlns:v="urn:schemas-microsoft-com:vml" xmlns:wp14="http://schemas.microsoft.com/office/word/2010/wordprocessingDrawing" xmlns:wp="http://schemas.openxmlformats.org/drawingml/2006/wordprocessingDrawing" xmlns:w10="urn:schemas-microsoft-com:office:word" xmlns:w="http://schemas.openxmlformats.org/wordprocessingml/2006/main" xmlns:w14="http://schemas.microsoft.com/office/word/2010/wordml" xmlns:w15="http://schemas.microsoft.com/office/word/2012/wordml" xmlns:w16cex="http://schemas.microsoft.com/office/word/2018/wordml/cex" xmlns:w16cid="http://schemas.microsoft.com/office/word/2016/wordml/cid" xmlns:w16="http://schemas.microsoft.com/office/word/2018/wordml" xmlns:w16du="http://schemas.microsoft.com/office/word/2023/wordml/word16du" xmlns:w16sdtdh="http://schemas.microsoft.com/office/word/2020/wordml/sdtdatahash" xmlns:w16sdtfl="http://schemas.microsoft.com/office/word/2024/wordml/sdtformatlock" xmlns:w16se="http://schemas.microsoft.com/office/word/2015/wordml/symex" xmlns:wpg="http://schemas.microsoft.com/office/word/2010/wordprocessingGroup" xmlns:wpi="http://schemas.microsoft.com/office/word/2010/wordprocessingInk" xmlns:wne="http://schemas.microsoft.com/office/word/2006/wordml" xmlns:wps="http://schemas.microsoft.com/office/word/2010/wordprocessingShape" mc:Ignorable="w14 w15 w16se w16cid w16 w16cex w16sdtdh w16sdtfl w16du wp14">
   <w:tbl>
     <w:tblPr>
       <w:tblStyle w:val="Tablaconcuadrcula"/>
@@ -3282,7 +3331,7 @@
 </file>
 
 <file path=word/header3.xml><?xml version="1.0" encoding="utf-8"?>
-<w:hdr xmlns:wpc="http://schemas.microsoft.com/office/word/2010/wordprocessingCanvas" xmlns:cx="http://schemas.microsoft.com/office/drawing/2014/chartex" xmlns:cx1="http://schemas.microsoft.com/office/drawing/2015/9/8/chartex" xmlns:cx2="http://schemas.microsoft.com/office/drawing/2015/10/21/chartex" xmlns:cx3="http://schemas.microsoft.com/office/drawing/2016/5/9/chartex" xmlns:cx4="http://schemas.microsoft.com/office/drawing/2016/5/10/chartex" xmlns:cx5="http://schemas.microsoft.com/office/drawing/2016/5/11/chartex" xmlns:cx6="http://schemas.microsoft.com/office/drawing/2016/5/12/chartex" xmlns:cx7="http://schemas.microsoft.com/office/drawing/2016/5/13/chartex" xmlns:cx8="http://schemas.microsoft.com/office/drawing/2016/5/14/chartex" xmlns:mc="http://schemas.openxmlformats.org/markup-compatibility/2006" xmlns:aink="http://schemas.microsoft.com/office/drawing/2016/ink" xmlns:am3d="http://schemas.microsoft.com/office/drawing/2017/model3d" xmlns:o="urn:schemas-microsoft-com:office:office" xmlns:r="http://schemas.openxmlformats.org/officeDocument/2006/relationships" xmlns:m="http://schemas.openxmlformats.org/officeDocument/2006/math" xmlns:v="urn:schemas-microsoft-com:vml" xmlns:wp14="http://schemas.microsoft.com/office/word/2010/wordprocessingDrawing" xmlns:wp="http://schemas.openxmlformats.org/drawingml/2006/wordprocessingDrawing" xmlns:w10="urn:schemas-microsoft-com:office:word" xmlns:w="http://schemas.openxmlformats.org/wordprocessingml/2006/main" xmlns:w14="http://schemas.microsoft.com/office/word/2010/wordml" xmlns:w15="http://schemas.microsoft.com/office/word/2012/wordml" xmlns:w16cex="http://schemas.microsoft.com/office/word/2018/wordml/cex" xmlns:w16cid="http://schemas.microsoft.com/office/word/2016/wordml/cid" xmlns:w16="http://schemas.microsoft.com/office/word/2018/wordml" xmlns:w16sdtdh="http://schemas.microsoft.com/office/word/2020/wordml/sdtdatahash" xmlns:w16se="http://schemas.microsoft.com/office/word/2015/wordml/symex" xmlns:wpg="http://schemas.microsoft.com/office/word/2010/wordprocessingGroup" xmlns:wpi="http://schemas.microsoft.com/office/word/2010/wordprocessingInk" xmlns:wne="http://schemas.microsoft.com/office/word/2006/wordml" xmlns:wps="http://schemas.microsoft.com/office/word/2010/wordprocessingShape" mc:Ignorable="w14 w15 w16se w16cid w16 w16cex w16sdtdh wp14">
+<w:hdr xmlns:wpc="http://schemas.microsoft.com/office/word/2010/wordprocessingCanvas" xmlns:cx="http://schemas.microsoft.com/office/drawing/2014/chartex" xmlns:cx1="http://schemas.microsoft.com/office/drawing/2015/9/8/chartex" xmlns:cx2="http://schemas.microsoft.com/office/drawing/2015/10/21/chartex" xmlns:cx3="http://schemas.microsoft.com/office/drawing/2016/5/9/chartex" xmlns:cx4="http://schemas.microsoft.com/office/drawing/2016/5/10/chartex" xmlns:cx5="http://schemas.microsoft.com/office/drawing/2016/5/11/chartex" xmlns:cx6="http://schemas.microsoft.com/office/drawing/2016/5/12/chartex" xmlns:cx7="http://schemas.microsoft.com/office/drawing/2016/5/13/chartex" xmlns:cx8="http://schemas.microsoft.com/office/drawing/2016/5/14/chartex" xmlns:mc="http://schemas.openxmlformats.org/markup-compatibility/2006" xmlns:aink="http://schemas.microsoft.com/office/drawing/2016/ink" xmlns:am3d="http://schemas.microsoft.com/office/drawing/2017/model3d" xmlns:o="urn:schemas-microsoft-com:office:office" xmlns:oel="http://schemas.microsoft.com/office/2019/extlst" xmlns:r="http://schemas.openxmlformats.org/officeDocument/2006/relationships" xmlns:m="http://schemas.openxmlformats.org/officeDocument/2006/math" xmlns:v="urn:schemas-microsoft-com:vml" xmlns:wp14="http://schemas.microsoft.com/office/word/2010/wordprocessingDrawing" xmlns:wp="http://schemas.openxmlformats.org/drawingml/2006/wordprocessingDrawing" xmlns:w10="urn:schemas-microsoft-com:office:word" xmlns:w="http://schemas.openxmlformats.org/wordprocessingml/2006/main" xmlns:w14="http://schemas.microsoft.com/office/word/2010/wordml" xmlns:w15="http://schemas.microsoft.com/office/word/2012/wordml" xmlns:w16cex="http://schemas.microsoft.com/office/word/2018/wordml/cex" xmlns:w16cid="http://schemas.microsoft.com/office/word/2016/wordml/cid" xmlns:w16="http://schemas.microsoft.com/office/word/2018/wordml" xmlns:w16du="http://schemas.microsoft.com/office/word/2023/wordml/word16du" xmlns:w16sdtdh="http://schemas.microsoft.com/office/word/2020/wordml/sdtdatahash" xmlns:w16sdtfl="http://schemas.microsoft.com/office/word/2024/wordml/sdtformatlock" xmlns:w16se="http://schemas.microsoft.com/office/word/2015/wordml/symex" xmlns:wpg="http://schemas.microsoft.com/office/word/2010/wordprocessingGroup" xmlns:wpi="http://schemas.microsoft.com/office/word/2010/wordprocessingInk" xmlns:wne="http://schemas.microsoft.com/office/word/2006/wordml" xmlns:wps="http://schemas.microsoft.com/office/word/2010/wordprocessingShape" mc:Ignorable="w14 w15 w16se w16cid w16 w16cex w16sdtdh w16sdtfl w16du wp14">
   <w:tbl>
     <w:tblPr>
       <w:tblStyle w:val="Tablaconcuadrcula"/>
@@ -3573,7 +3622,7 @@
 </file>
 
 <file path=word/numbering.xml><?xml version="1.0" encoding="utf-8"?>
-<w:numbering xmlns:wpc="http://schemas.microsoft.com/office/word/2010/wordprocessingCanvas" xmlns:cx="http://schemas.microsoft.com/office/drawing/2014/chartex" xmlns:cx1="http://schemas.microsoft.com/office/drawing/2015/9/8/chartex" xmlns:cx2="http://schemas.microsoft.com/office/drawing/2015/10/21/chartex" xmlns:cx3="http://schemas.microsoft.com/office/drawing/2016/5/9/chartex" xmlns:cx4="http://schemas.microsoft.com/office/drawing/2016/5/10/chartex" xmlns:cx5="http://schemas.microsoft.com/office/drawing/2016/5/11/chartex" xmlns:cx6="http://schemas.microsoft.com/office/drawing/2016/5/12/chartex" xmlns:cx7="http://schemas.microsoft.com/office/drawing/2016/5/13/chartex" xmlns:cx8="http://schemas.microsoft.com/office/drawing/2016/5/14/chartex" xmlns:mc="http://schemas.openxmlformats.org/markup-compatibility/2006" xmlns:aink="http://schemas.microsoft.com/office/drawing/2016/ink" xmlns:am3d="http://schemas.microsoft.com/office/drawing/2017/model3d" xmlns:o="urn:schemas-microsoft-com:office:office" xmlns:r="http://schemas.openxmlformats.org/officeDocument/2006/relationships" xmlns:m="http://schemas.openxmlformats.org/officeDocument/2006/math" xmlns:v="urn:schemas-microsoft-com:vml" xmlns:wp14="http://schemas.microsoft.com/office/word/2010/wordprocessingDrawing" xmlns:wp="http://schemas.openxmlformats.org/drawingml/2006/wordprocessingDrawing" xmlns:w10="urn:schemas-microsoft-com:office:word" xmlns:w="http://schemas.openxmlformats.org/wordprocessingml/2006/main" xmlns:w14="http://schemas.microsoft.com/office/word/2010/wordml" xmlns:w15="http://schemas.microsoft.com/office/word/2012/wordml" xmlns:w16cex="http://schemas.microsoft.com/office/word/2018/wordml/cex" xmlns:w16cid="http://schemas.microsoft.com/office/word/2016/wordml/cid" xmlns:w16="http://schemas.microsoft.com/office/word/2018/wordml" xmlns:w16sdtdh="http://schemas.microsoft.com/office/word/2020/wordml/sdtdatahash" xmlns:w16se="http://schemas.microsoft.com/office/word/2015/wordml/symex" xmlns:wpg="http://schemas.microsoft.com/office/word/2010/wordprocessingGroup" xmlns:wpi="http://schemas.microsoft.com/office/word/2010/wordprocessingInk" xmlns:wne="http://schemas.microsoft.com/office/word/2006/wordml" xmlns:wps="http://schemas.microsoft.com/office/word/2010/wordprocessingShape" mc:Ignorable="w14 w15 w16se w16cid w16 w16cex w16sdtdh wp14">
+<w:numbering xmlns:wpc="http://schemas.microsoft.com/office/word/2010/wordprocessingCanvas" xmlns:cx="http://schemas.microsoft.com/office/drawing/2014/chartex" xmlns:cx1="http://schemas.microsoft.com/office/drawing/2015/9/8/chartex" xmlns:cx2="http://schemas.microsoft.com/office/drawing/2015/10/21/chartex" xmlns:cx3="http://schemas.microsoft.com/office/drawing/2016/5/9/chartex" xmlns:cx4="http://schemas.microsoft.com/office/drawing/2016/5/10/chartex" xmlns:cx5="http://schemas.microsoft.com/office/drawing/2016/5/11/chartex" xmlns:cx6="http://schemas.microsoft.com/office/drawing/2016/5/12/chartex" xmlns:cx7="http://schemas.microsoft.com/office/drawing/2016/5/13/chartex" xmlns:cx8="http://schemas.microsoft.com/office/drawing/2016/5/14/chartex" xmlns:mc="http://schemas.openxmlformats.org/markup-compatibility/2006" xmlns:aink="http://schemas.microsoft.com/office/drawing/2016/ink" xmlns:am3d="http://schemas.microsoft.com/office/drawing/2017/model3d" xmlns:o="urn:schemas-microsoft-com:office:office" xmlns:oel="http://schemas.microsoft.com/office/2019/extlst" xmlns:r="http://schemas.openxmlformats.org/officeDocument/2006/relationships" xmlns:m="http://schemas.openxmlformats.org/officeDocument/2006/math" xmlns:v="urn:schemas-microsoft-com:vml" xmlns:wp14="http://schemas.microsoft.com/office/word/2010/wordprocessingDrawing" xmlns:wp="http://schemas.openxmlformats.org/drawingml/2006/wordprocessingDrawing" xmlns:w10="urn:schemas-microsoft-com:office:word" xmlns:w="http://schemas.openxmlformats.org/wordprocessingml/2006/main" xmlns:w14="http://schemas.microsoft.com/office/word/2010/wordml" xmlns:w15="http://schemas.microsoft.com/office/word/2012/wordml" xmlns:w16cex="http://schemas.microsoft.com/office/word/2018/wordml/cex" xmlns:w16cid="http://schemas.microsoft.com/office/word/2016/wordml/cid" xmlns:w16="http://schemas.microsoft.com/office/word/2018/wordml" xmlns:w16du="http://schemas.microsoft.com/office/word/2023/wordml/word16du" xmlns:w16sdtdh="http://schemas.microsoft.com/office/word/2020/wordml/sdtdatahash" xmlns:w16sdtfl="http://schemas.microsoft.com/office/word/2024/wordml/sdtformatlock" xmlns:w16se="http://schemas.microsoft.com/office/word/2015/wordml/symex" xmlns:wpg="http://schemas.microsoft.com/office/word/2010/wordprocessingGroup" xmlns:wpi="http://schemas.microsoft.com/office/word/2010/wordprocessingInk" xmlns:wne="http://schemas.microsoft.com/office/word/2006/wordml" xmlns:wps="http://schemas.microsoft.com/office/word/2010/wordprocessingShape" mc:Ignorable="w14 w15 w16se w16cid w16 w16cex w16sdtdh w16sdtfl w16du wp14">
   <w:abstractNum w:abstractNumId="0" w15:restartNumberingAfterBreak="0">
     <w:nsid w:val="049156A1"/>
     <w:multiLevelType w:val="hybridMultilevel"/>
@@ -8259,127 +8308,127 @@
       </w:rPr>
     </w:lvl>
   </w:abstractNum>
-  <w:num w:numId="1">
+  <w:num w:numId="1" w16cid:durableId="1880236649">
     <w:abstractNumId w:val="3"/>
   </w:num>
-  <w:num w:numId="2">
+  <w:num w:numId="2" w16cid:durableId="13654241">
     <w:abstractNumId w:val="9"/>
   </w:num>
-  <w:num w:numId="3">
+  <w:num w:numId="3" w16cid:durableId="1364089437">
     <w:abstractNumId w:val="13"/>
   </w:num>
-  <w:num w:numId="4">
+  <w:num w:numId="4" w16cid:durableId="245381980">
     <w:abstractNumId w:val="29"/>
   </w:num>
-  <w:num w:numId="5">
+  <w:num w:numId="5" w16cid:durableId="678508277">
     <w:abstractNumId w:val="31"/>
   </w:num>
-  <w:num w:numId="6">
+  <w:num w:numId="6" w16cid:durableId="423847607">
     <w:abstractNumId w:val="4"/>
   </w:num>
-  <w:num w:numId="7">
+  <w:num w:numId="7" w16cid:durableId="315302664">
     <w:abstractNumId w:val="12"/>
   </w:num>
-  <w:num w:numId="8">
+  <w:num w:numId="8" w16cid:durableId="3871523">
     <w:abstractNumId w:val="20"/>
   </w:num>
-  <w:num w:numId="9">
+  <w:num w:numId="9" w16cid:durableId="1732076846">
     <w:abstractNumId w:val="16"/>
   </w:num>
-  <w:num w:numId="10">
+  <w:num w:numId="10" w16cid:durableId="222371453">
     <w:abstractNumId w:val="10"/>
   </w:num>
-  <w:num w:numId="11">
+  <w:num w:numId="11" w16cid:durableId="258373918">
     <w:abstractNumId w:val="25"/>
   </w:num>
-  <w:num w:numId="12">
+  <w:num w:numId="12" w16cid:durableId="720324256">
     <w:abstractNumId w:val="36"/>
   </w:num>
-  <w:num w:numId="13">
+  <w:num w:numId="13" w16cid:durableId="337343337">
     <w:abstractNumId w:val="30"/>
   </w:num>
-  <w:num w:numId="14">
+  <w:num w:numId="14" w16cid:durableId="248196956">
     <w:abstractNumId w:val="1"/>
   </w:num>
-  <w:num w:numId="15">
+  <w:num w:numId="15" w16cid:durableId="1852792298">
     <w:abstractNumId w:val="37"/>
   </w:num>
-  <w:num w:numId="16">
+  <w:num w:numId="16" w16cid:durableId="1373573766">
     <w:abstractNumId w:val="22"/>
   </w:num>
-  <w:num w:numId="17">
+  <w:num w:numId="17" w16cid:durableId="640620648">
     <w:abstractNumId w:val="18"/>
   </w:num>
-  <w:num w:numId="18">
+  <w:num w:numId="18" w16cid:durableId="2041009759">
     <w:abstractNumId w:val="32"/>
   </w:num>
-  <w:num w:numId="19">
+  <w:num w:numId="19" w16cid:durableId="103158276">
     <w:abstractNumId w:val="11"/>
   </w:num>
-  <w:num w:numId="20">
+  <w:num w:numId="20" w16cid:durableId="580019911">
     <w:abstractNumId w:val="40"/>
   </w:num>
-  <w:num w:numId="21">
+  <w:num w:numId="21" w16cid:durableId="2118478777">
     <w:abstractNumId w:val="35"/>
   </w:num>
-  <w:num w:numId="22">
+  <w:num w:numId="22" w16cid:durableId="304160565">
     <w:abstractNumId w:val="14"/>
   </w:num>
-  <w:num w:numId="23">
+  <w:num w:numId="23" w16cid:durableId="1341158714">
     <w:abstractNumId w:val="15"/>
   </w:num>
-  <w:num w:numId="24">
+  <w:num w:numId="24" w16cid:durableId="194730725">
     <w:abstractNumId w:val="5"/>
   </w:num>
-  <w:num w:numId="25">
+  <w:num w:numId="25" w16cid:durableId="653147388">
     <w:abstractNumId w:val="17"/>
   </w:num>
-  <w:num w:numId="26">
+  <w:num w:numId="26" w16cid:durableId="124541404">
     <w:abstractNumId w:val="21"/>
   </w:num>
-  <w:num w:numId="27">
+  <w:num w:numId="27" w16cid:durableId="606012038">
     <w:abstractNumId w:val="24"/>
   </w:num>
-  <w:num w:numId="28">
+  <w:num w:numId="28" w16cid:durableId="543368370">
     <w:abstractNumId w:val="0"/>
   </w:num>
-  <w:num w:numId="29">
+  <w:num w:numId="29" w16cid:durableId="908198825">
     <w:abstractNumId w:val="19"/>
   </w:num>
-  <w:num w:numId="30">
+  <w:num w:numId="30" w16cid:durableId="728187862">
     <w:abstractNumId w:val="23"/>
   </w:num>
-  <w:num w:numId="31">
+  <w:num w:numId="31" w16cid:durableId="299773551">
     <w:abstractNumId w:val="2"/>
   </w:num>
-  <w:num w:numId="32">
+  <w:num w:numId="32" w16cid:durableId="1764716194">
     <w:abstractNumId w:val="7"/>
   </w:num>
-  <w:num w:numId="33">
+  <w:num w:numId="33" w16cid:durableId="1746099808">
     <w:abstractNumId w:val="33"/>
   </w:num>
-  <w:num w:numId="34">
+  <w:num w:numId="34" w16cid:durableId="773986769">
     <w:abstractNumId w:val="39"/>
   </w:num>
-  <w:num w:numId="35">
+  <w:num w:numId="35" w16cid:durableId="449667387">
     <w:abstractNumId w:val="6"/>
   </w:num>
-  <w:num w:numId="36">
+  <w:num w:numId="36" w16cid:durableId="1236630167">
     <w:abstractNumId w:val="26"/>
   </w:num>
-  <w:num w:numId="37">
+  <w:num w:numId="37" w16cid:durableId="1435708431">
     <w:abstractNumId w:val="38"/>
   </w:num>
-  <w:num w:numId="38">
+  <w:num w:numId="38" w16cid:durableId="742096448">
     <w:abstractNumId w:val="28"/>
   </w:num>
-  <w:num w:numId="39">
+  <w:num w:numId="39" w16cid:durableId="441266688">
     <w:abstractNumId w:val="27"/>
   </w:num>
-  <w:num w:numId="40">
+  <w:num w:numId="40" w16cid:durableId="1228417074">
     <w:abstractNumId w:val="34"/>
   </w:num>
-  <w:num w:numId="41">
+  <w:num w:numId="41" w16cid:durableId="954092184">
     <w:abstractNumId w:val="8"/>
   </w:num>
   <w:numIdMacAtCleanup w:val="18"/>
@@ -8387,7 +8436,7 @@
 </file>
 
 <file path=word/styles.xml><?xml version="1.0" encoding="utf-8"?>
-<w:styles xmlns:mc="http://schemas.openxmlformats.org/markup-compatibility/2006" xmlns:r="http://schemas.openxmlformats.org/officeDocument/2006/relationships" xmlns:w="http://schemas.openxmlformats.org/wordprocessingml/2006/main" xmlns:w14="http://schemas.microsoft.com/office/word/2010/wordml" xmlns:w15="http://schemas.microsoft.com/office/word/2012/wordml" xmlns:w16cex="http://schemas.microsoft.com/office/word/2018/wordml/cex" xmlns:w16cid="http://schemas.microsoft.com/office/word/2016/wordml/cid" xmlns:w16="http://schemas.microsoft.com/office/word/2018/wordml" xmlns:w16sdtdh="http://schemas.microsoft.com/office/word/2020/wordml/sdtdatahash" xmlns:w16se="http://schemas.microsoft.com/office/word/2015/wordml/symex" mc:Ignorable="w14 w15 w16se w16cid w16 w16cex w16sdtdh">
+<w:styles xmlns:mc="http://schemas.openxmlformats.org/markup-compatibility/2006" xmlns:r="http://schemas.openxmlformats.org/officeDocument/2006/relationships" xmlns:w="http://schemas.openxmlformats.org/wordprocessingml/2006/main" xmlns:w14="http://schemas.microsoft.com/office/word/2010/wordml" xmlns:w15="http://schemas.microsoft.com/office/word/2012/wordml" xmlns:w16cex="http://schemas.microsoft.com/office/word/2018/wordml/cex" xmlns:w16cid="http://schemas.microsoft.com/office/word/2016/wordml/cid" xmlns:w16="http://schemas.microsoft.com/office/word/2018/wordml" xmlns:w16du="http://schemas.microsoft.com/office/word/2023/wordml/word16du" xmlns:w16sdtdh="http://schemas.microsoft.com/office/word/2020/wordml/sdtdatahash" xmlns:w16sdtfl="http://schemas.microsoft.com/office/word/2024/wordml/sdtformatlock" xmlns:w16se="http://schemas.microsoft.com/office/word/2015/wordml/symex" mc:Ignorable="w14 w15 w16se w16cid w16 w16cex w16sdtdh w16sdtfl w16du">
   <w:docDefaults>
     <w:rPrDefault>
       <w:rPr>
@@ -10154,10 +10203,19 @@
 </file>
 
 <file path=customXml/item1.xml><?xml version="1.0" encoding="utf-8"?>
+<?mso-contentType ?>
+<FormTemplates xmlns="http://schemas.microsoft.com/sharepoint/v3/contenttype/forms">
+  <Display>DocumentLibraryForm</Display>
+  <Edit>DocumentLibraryForm</Edit>
+  <New>DocumentLibraryForm</New>
+</FormTemplates>
+</file>
+
+<file path=customXml/item2.xml><?xml version="1.0" encoding="utf-8"?>
 <b:Sources xmlns:b="http://schemas.openxmlformats.org/officeDocument/2006/bibliography" xmlns="http://schemas.openxmlformats.org/officeDocument/2006/bibliography" SelectedStyle="\APASixthEditionOfficeOnline.xsl" StyleName="APA" Version="6"/>
 </file>
 
-<file path=customXml/item2.xml><?xml version="1.0" encoding="utf-8"?>
+<file path=customXml/item3.xml><?xml version="1.0" encoding="utf-8"?>
 <ct:contentTypeSchema xmlns:ct="http://schemas.microsoft.com/office/2006/metadata/contentType" xmlns:ma="http://schemas.microsoft.com/office/2006/metadata/properties/metaAttributes" ct:_="" ma:_="" ma:contentTypeName="Documento" ma:contentTypeID="0x010100E96778489EE7714D8BD12CC105EB918B" ma:contentTypeVersion="2" ma:contentTypeDescription="Crear nuevo documento." ma:contentTypeScope="" ma:versionID="416c5c7ae9b5d54d83875cd3c65194e3">
   <xsd:schema xmlns:xsd="http://www.w3.org/2001/XMLSchema" xmlns:xs="http://www.w3.org/2001/XMLSchema" xmlns:p="http://schemas.microsoft.com/office/2006/metadata/properties" xmlns:ns2="126e8a1c-9ea9-435a-ac89-d06c80d62e30" targetNamespace="http://schemas.microsoft.com/office/2006/metadata/properties" ma:root="true" ma:fieldsID="70a237c842677bd850644f8595079f5e" ns2:_="">
     <xsd:import namespace="126e8a1c-9ea9-435a-ac89-d06c80d62e30"/>
@@ -10289,22 +10347,21 @@
 </ct:contentTypeSchema>
 </file>
 
-<file path=customXml/item3.xml><?xml version="1.0" encoding="utf-8"?>
+<file path=customXml/item4.xml><?xml version="1.0" encoding="utf-8"?>
 <p:properties xmlns:p="http://schemas.microsoft.com/office/2006/metadata/properties" xmlns:xsi="http://www.w3.org/2001/XMLSchema-instance" xmlns:pc="http://schemas.microsoft.com/office/infopath/2007/PartnerControls">
   <documentManagement/>
 </p:properties>
 </file>
 
-<file path=customXml/item4.xml><?xml version="1.0" encoding="utf-8"?>
-<?mso-contentType ?>
-<FormTemplates xmlns="http://schemas.microsoft.com/sharepoint/v3/contenttype/forms">
-  <Display>DocumentLibraryForm</Display>
-  <Edit>DocumentLibraryForm</Edit>
-  <New>DocumentLibraryForm</New>
-</FormTemplates>
+<file path=customXml/itemProps1.xml><?xml version="1.0" encoding="utf-8"?>
+<ds:datastoreItem xmlns:ds="http://schemas.openxmlformats.org/officeDocument/2006/customXml" ds:itemID="{DABAA964-10BA-4DBC-ABF2-CDEAC0FAF7AA}">
+  <ds:schemaRefs>
+    <ds:schemaRef ds:uri="http://schemas.microsoft.com/sharepoint/v3/contenttype/forms"/>
+  </ds:schemaRefs>
+</ds:datastoreItem>
 </file>
 
-<file path=customXml/itemProps1.xml><?xml version="1.0" encoding="utf-8"?>
+<file path=customXml/itemProps2.xml><?xml version="1.0" encoding="utf-8"?>
 <ds:datastoreItem xmlns:ds="http://schemas.openxmlformats.org/officeDocument/2006/customXml" ds:itemID="{6E8A10B9-B765-4F0B-A47F-7CB788CD8F65}">
   <ds:schemaRefs>
     <ds:schemaRef ds:uri="http://schemas.openxmlformats.org/officeDocument/2006/bibliography"/>
@@ -10312,7 +10369,7 @@
 </ds:datastoreItem>
 </file>
 
-<file path=customXml/itemProps2.xml><?xml version="1.0" encoding="utf-8"?>
+<file path=customXml/itemProps3.xml><?xml version="1.0" encoding="utf-8"?>
 <ds:datastoreItem xmlns:ds="http://schemas.openxmlformats.org/officeDocument/2006/customXml" ds:itemID="{767CD2D5-7A6C-47C3-9B54-C4225C74DD0B}">
   <ds:schemaRefs>
     <ds:schemaRef ds:uri="http://schemas.microsoft.com/office/2006/metadata/contentType"/>
@@ -10330,19 +10387,11 @@
 </ds:datastoreItem>
 </file>
 
-<file path=customXml/itemProps3.xml><?xml version="1.0" encoding="utf-8"?>
+<file path=customXml/itemProps4.xml><?xml version="1.0" encoding="utf-8"?>
 <ds:datastoreItem xmlns:ds="http://schemas.openxmlformats.org/officeDocument/2006/customXml" ds:itemID="{5F1783E3-BA1C-4CA3-8E32-C9B378BBED03}">
   <ds:schemaRefs>
     <ds:schemaRef ds:uri="http://schemas.microsoft.com/office/2006/metadata/properties"/>
     <ds:schemaRef ds:uri="http://schemas.microsoft.com/office/infopath/2007/PartnerControls"/>
   </ds:schemaRefs>
 </ds:datastoreItem>
-</file>
-
-<file path=customXml/itemProps4.xml><?xml version="1.0" encoding="utf-8"?>
-<ds:datastoreItem xmlns:ds="http://schemas.openxmlformats.org/officeDocument/2006/customXml" ds:itemID="{DABAA964-10BA-4DBC-ABF2-CDEAC0FAF7AA}">
-  <ds:schemaRefs>
-    <ds:schemaRef ds:uri="http://schemas.microsoft.com/sharepoint/v3/contenttype/forms"/>
-  </ds:schemaRefs>
-</ds:datastoreItem>
 </file>
</xml_diff>